<commit_message>
feat: Add unit tests for S-140 XML generator and enhance document generation logic
- Implement unit tests for XML escaping, date formatting, and chapter formatting in `generadorS140Xml`.
- Enhance `generarFilasSemanaXml` to handle special cases for Circuit Overseer visits and assembly notifications.
- Update `generarS140.js` to include new formatting functions and improve data building from Supabase.
- Modify `Programa.jsx` to allow selection between dynamic and classic document generation modes.
- Introduce a dropdown menu in `S140Preview.jsx` for Word document download options.
- Add CSS class for serif font styling in print styles.
</commit_message>
<xml_diff>
--- a/participantes-app/public/S-140_plantilla.docx
+++ b/participantes-app/public/S-140_plantilla.docx
@@ -39,11 +39,15 @@
               <w:spacing w:after="60" w:line="240" w:lineRule="auto"/>
               <w:rPr>
                 <w:b/>
-              </w:rPr>
-            </w:pPr>
-            <w:r>
-              <w:rPr>
-                <w:b/>
+                <w:sz w:val="28"/>
+                <w:szCs w:val="28"/>
+              </w:rPr>
+            </w:pPr>
+            <w:r>
+              <w:rPr>
+                <w:b/>
+                <w:sz w:val="28"/>
+                <w:szCs w:val="28"/>
               </w:rPr>
               <w:t>{$</w:t>
             </w:r>
@@ -52,6 +56,8 @@
               <w:rPr>
                 <w:b/>
                 <w:bCs/>
+                <w:sz w:val="28"/>
+                <w:szCs w:val="28"/>
               </w:rPr>
               <w:t>congregacion</w:t>
             </w:r>
@@ -59,6 +65,8 @@
             <w:r>
               <w:rPr>
                 <w:b/>
+                <w:sz w:val="28"/>
+                <w:szCs w:val="28"/>
               </w:rPr>
               <w:t>$}</w:t>
             </w:r>
@@ -144,6 +152,7 @@
             <w:pPr>
               <w:spacing w:after="0" w:line="240" w:lineRule="auto"/>
               <w:rPr>
+                <w:rFonts w:ascii="Times New Roman" w:hAnsi="Times New Roman" w:cs="Times New Roman"/>
                 <w:b/>
                 <w:color w:val="808080" w:themeColor="background1" w:themeShade="80"/>
                 <w:sz w:val="16"/>
@@ -153,6 +162,7 @@
             </w:pPr>
             <w:r>
               <w:rPr>
+                <w:rFonts w:ascii="Times New Roman" w:hAnsi="Times New Roman" w:cs="Times New Roman"/>
                 <w:b/>
                 <w:lang w:val="es-MX"/>
               </w:rPr>
@@ -206,6 +216,9 @@
               <w:spacing w:after="0" w:line="240" w:lineRule="auto"/>
             </w:pPr>
             <w:r>
+              <w:rPr>
+                <w:rFonts w:ascii="Times New Roman" w:hAnsi="Times New Roman" w:cs="Times New Roman"/>
+              </w:rPr>
               <w:t>{$s1_presidente$}</w:t>
             </w:r>
           </w:p>
@@ -354,6 +367,9 @@
               <w:spacing w:after="0" w:line="240" w:lineRule="auto"/>
             </w:pPr>
             <w:r>
+              <w:rPr>
+                <w:rFonts w:ascii="Times New Roman" w:hAnsi="Times New Roman" w:cs="Times New Roman"/>
+              </w:rPr>
               <w:t>{$s1_oracion_ap$}</w:t>
             </w:r>
           </w:p>
@@ -710,6 +726,9 @@
               <w:spacing w:after="0" w:line="240" w:lineRule="auto"/>
             </w:pPr>
             <w:r>
+              <w:rPr>
+                <w:rFonts w:ascii="Times New Roman" w:hAnsi="Times New Roman" w:cs="Times New Roman"/>
+              </w:rPr>
               <w:t>{$s1_tb_cond$}</w:t>
             </w:r>
           </w:p>
@@ -869,6 +888,9 @@
               <w:spacing w:after="0" w:line="240" w:lineRule="auto"/>
             </w:pPr>
             <w:r>
+              <w:rPr>
+                <w:rFonts w:ascii="Times New Roman" w:hAnsi="Times New Roman" w:cs="Times New Roman"/>
+              </w:rPr>
               <w:t>{$s1_pe_cond$}</w:t>
             </w:r>
           </w:p>
@@ -1028,6 +1050,9 @@
               <w:spacing w:after="0" w:line="240" w:lineRule="auto"/>
             </w:pPr>
             <w:r>
+              <w:rPr>
+                <w:rFonts w:ascii="Times New Roman" w:hAnsi="Times New Roman" w:cs="Times New Roman"/>
+              </w:rPr>
               <w:t>{$s1_lb_est$}</w:t>
             </w:r>
           </w:p>
@@ -1314,14 +1339,23 @@
               <w:spacing w:after="0" w:line="240" w:lineRule="auto"/>
             </w:pPr>
             <w:r>
+              <w:rPr>
+                <w:rFonts w:ascii="Times New Roman" w:hAnsi="Times New Roman" w:cs="Times New Roman"/>
+              </w:rPr>
               <w:t>{$s1_smt1_est</w:t>
             </w:r>
             <w:proofErr w:type="gramStart"/>
             <w:r>
-              <w:t>$}/{</w:t>
+              <w:rPr>
+                <w:rFonts w:ascii="Times New Roman" w:hAnsi="Times New Roman" w:cs="Times New Roman"/>
+              </w:rPr>
+              <w:t>$} / {</w:t>
             </w:r>
             <w:proofErr w:type="gramEnd"/>
             <w:r>
+              <w:rPr>
+                <w:rFonts w:ascii="Times New Roman" w:hAnsi="Times New Roman" w:cs="Times New Roman"/>
+              </w:rPr>
               <w:t>$s1_smt1_ayu$}</w:t>
             </w:r>
           </w:p>
@@ -1501,14 +1535,23 @@
               <w:spacing w:after="0" w:line="240" w:lineRule="auto"/>
             </w:pPr>
             <w:r>
+              <w:rPr>
+                <w:rFonts w:ascii="Times New Roman" w:hAnsi="Times New Roman" w:cs="Times New Roman"/>
+              </w:rPr>
               <w:t>{$s1_smt2_est</w:t>
             </w:r>
             <w:proofErr w:type="gramStart"/>
             <w:r>
-              <w:t>$}/{</w:t>
+              <w:rPr>
+                <w:rFonts w:ascii="Times New Roman" w:hAnsi="Times New Roman" w:cs="Times New Roman"/>
+              </w:rPr>
+              <w:t>$} / {</w:t>
             </w:r>
             <w:proofErr w:type="gramEnd"/>
             <w:r>
+              <w:rPr>
+                <w:rFonts w:ascii="Times New Roman" w:hAnsi="Times New Roman" w:cs="Times New Roman"/>
+              </w:rPr>
               <w:t>$s1_smt2_ayu$}</w:t>
             </w:r>
           </w:p>
@@ -1688,14 +1731,23 @@
               <w:spacing w:after="0" w:line="240" w:lineRule="auto"/>
             </w:pPr>
             <w:r>
+              <w:rPr>
+                <w:rFonts w:ascii="Times New Roman" w:hAnsi="Times New Roman" w:cs="Times New Roman"/>
+              </w:rPr>
               <w:t>{$s1_smt3_est</w:t>
             </w:r>
             <w:proofErr w:type="gramStart"/>
             <w:r>
-              <w:t>$}/{</w:t>
+              <w:rPr>
+                <w:rFonts w:ascii="Times New Roman" w:hAnsi="Times New Roman" w:cs="Times New Roman"/>
+              </w:rPr>
+              <w:t>$} / {</w:t>
             </w:r>
             <w:proofErr w:type="gramEnd"/>
             <w:r>
+              <w:rPr>
+                <w:rFonts w:ascii="Times New Roman" w:hAnsi="Times New Roman" w:cs="Times New Roman"/>
+              </w:rPr>
               <w:t>$s1_smt3_ayu$}</w:t>
             </w:r>
           </w:p>
@@ -1873,14 +1925,23 @@
               <w:spacing w:after="0" w:line="240" w:lineRule="auto"/>
             </w:pPr>
             <w:r>
+              <w:rPr>
+                <w:rFonts w:ascii="Times New Roman" w:hAnsi="Times New Roman" w:cs="Times New Roman"/>
+              </w:rPr>
               <w:t>{$s1_smt4_est</w:t>
             </w:r>
             <w:proofErr w:type="gramStart"/>
             <w:r>
-              <w:t>$}/{</w:t>
+              <w:rPr>
+                <w:rFonts w:ascii="Times New Roman" w:hAnsi="Times New Roman" w:cs="Times New Roman"/>
+              </w:rPr>
+              <w:t>$} / {</w:t>
             </w:r>
             <w:proofErr w:type="gramEnd"/>
             <w:r>
+              <w:rPr>
+                <w:rFonts w:ascii="Times New Roman" w:hAnsi="Times New Roman" w:cs="Times New Roman"/>
+              </w:rPr>
               <w:t>$s1_smt4_ayu$}</w:t>
             </w:r>
           </w:p>
@@ -2200,6 +2261,9 @@
               <w:spacing w:after="0" w:line="240" w:lineRule="auto"/>
             </w:pPr>
             <w:r>
+              <w:rPr>
+                <w:rFonts w:ascii="Times New Roman" w:hAnsi="Times New Roman" w:cs="Times New Roman"/>
+              </w:rPr>
               <w:t>{$s1_vc1_cond$}</w:t>
             </w:r>
           </w:p>
@@ -2345,6 +2409,9 @@
               <w:spacing w:after="0" w:line="240" w:lineRule="auto"/>
             </w:pPr>
             <w:r>
+              <w:rPr>
+                <w:rFonts w:ascii="Times New Roman" w:hAnsi="Times New Roman" w:cs="Times New Roman"/>
+              </w:rPr>
               <w:t>{$s1_vc2_cond$}</w:t>
             </w:r>
           </w:p>
@@ -2517,14 +2584,23 @@
               <w:spacing w:after="0" w:line="240" w:lineRule="auto"/>
             </w:pPr>
             <w:r>
+              <w:rPr>
+                <w:rFonts w:ascii="Times New Roman" w:hAnsi="Times New Roman" w:cs="Times New Roman"/>
+              </w:rPr>
               <w:t>{$s1_ebc_cond</w:t>
             </w:r>
             <w:proofErr w:type="gramStart"/>
             <w:r>
-              <w:t>$}/{</w:t>
+              <w:rPr>
+                <w:rFonts w:ascii="Times New Roman" w:hAnsi="Times New Roman" w:cs="Times New Roman"/>
+              </w:rPr>
+              <w:t>$} / {</w:t>
             </w:r>
             <w:proofErr w:type="gramEnd"/>
             <w:r>
+              <w:rPr>
+                <w:rFonts w:ascii="Times New Roman" w:hAnsi="Times New Roman" w:cs="Times New Roman"/>
+              </w:rPr>
               <w:t>$s1_ebc_lect$}</w:t>
             </w:r>
           </w:p>
@@ -2780,6 +2856,9 @@
               <w:spacing w:after="0" w:line="240" w:lineRule="auto"/>
             </w:pPr>
             <w:r>
+              <w:rPr>
+                <w:rFonts w:ascii="Times New Roman" w:hAnsi="Times New Roman" w:cs="Times New Roman"/>
+              </w:rPr>
               <w:t>{$s1_oracion_ci$}</w:t>
             </w:r>
           </w:p>
@@ -2873,6 +2952,7 @@
             <w:pPr>
               <w:spacing w:after="0" w:line="240" w:lineRule="auto"/>
               <w:rPr>
+                <w:rFonts w:ascii="Times New Roman" w:hAnsi="Times New Roman" w:cs="Times New Roman"/>
                 <w:b/>
                 <w:color w:val="808080" w:themeColor="background1" w:themeShade="80"/>
                 <w:sz w:val="16"/>
@@ -2882,6 +2962,7 @@
             </w:pPr>
             <w:r>
               <w:rPr>
+                <w:rFonts w:ascii="Times New Roman" w:hAnsi="Times New Roman" w:cs="Times New Roman"/>
                 <w:b/>
                 <w:lang w:val="es-MX"/>
               </w:rPr>
@@ -2889,6 +2970,7 @@
             </w:r>
             <w:r>
               <w:rPr>
+                <w:rFonts w:ascii="Times New Roman" w:hAnsi="Times New Roman" w:cs="Times New Roman"/>
                 <w:b/>
                 <w:lang w:val="es-MX"/>
               </w:rPr>
@@ -2896,6 +2978,7 @@
             </w:r>
             <w:r>
               <w:rPr>
+                <w:rFonts w:ascii="Times New Roman" w:hAnsi="Times New Roman" w:cs="Times New Roman"/>
                 <w:b/>
                 <w:lang w:val="es-MX"/>
               </w:rPr>
@@ -2949,12 +3032,21 @@
               <w:spacing w:after="0" w:line="240" w:lineRule="auto"/>
             </w:pPr>
             <w:r>
+              <w:rPr>
+                <w:rFonts w:ascii="Times New Roman" w:hAnsi="Times New Roman" w:cs="Times New Roman"/>
+              </w:rPr>
               <w:t>{$</w:t>
             </w:r>
             <w:r>
+              <w:rPr>
+                <w:rFonts w:ascii="Times New Roman" w:hAnsi="Times New Roman" w:cs="Times New Roman"/>
+              </w:rPr>
               <w:t>s2</w:t>
             </w:r>
             <w:r>
+              <w:rPr>
+                <w:rFonts w:ascii="Times New Roman" w:hAnsi="Times New Roman" w:cs="Times New Roman"/>
+              </w:rPr>
               <w:t>_presidente$}</w:t>
             </w:r>
           </w:p>
@@ -3109,12 +3201,21 @@
               <w:spacing w:after="0" w:line="240" w:lineRule="auto"/>
             </w:pPr>
             <w:r>
+              <w:rPr>
+                <w:rFonts w:ascii="Times New Roman" w:hAnsi="Times New Roman" w:cs="Times New Roman"/>
+              </w:rPr>
               <w:t>{$</w:t>
             </w:r>
             <w:r>
+              <w:rPr>
+                <w:rFonts w:ascii="Times New Roman" w:hAnsi="Times New Roman" w:cs="Times New Roman"/>
+              </w:rPr>
               <w:t>s2</w:t>
             </w:r>
             <w:r>
+              <w:rPr>
+                <w:rFonts w:ascii="Times New Roman" w:hAnsi="Times New Roman" w:cs="Times New Roman"/>
+              </w:rPr>
               <w:t>_oracion_ap$}</w:t>
             </w:r>
           </w:p>
@@ -3477,12 +3578,21 @@
               <w:spacing w:after="0" w:line="240" w:lineRule="auto"/>
             </w:pPr>
             <w:r>
+              <w:rPr>
+                <w:rFonts w:ascii="Times New Roman" w:hAnsi="Times New Roman" w:cs="Times New Roman"/>
+              </w:rPr>
               <w:t>{$</w:t>
             </w:r>
             <w:r>
+              <w:rPr>
+                <w:rFonts w:ascii="Times New Roman" w:hAnsi="Times New Roman" w:cs="Times New Roman"/>
+              </w:rPr>
               <w:t>s2</w:t>
             </w:r>
             <w:r>
+              <w:rPr>
+                <w:rFonts w:ascii="Times New Roman" w:hAnsi="Times New Roman" w:cs="Times New Roman"/>
+              </w:rPr>
               <w:t>_tb_cond$}</w:t>
             </w:r>
           </w:p>
@@ -3642,12 +3752,21 @@
               <w:spacing w:after="0" w:line="240" w:lineRule="auto"/>
             </w:pPr>
             <w:r>
+              <w:rPr>
+                <w:rFonts w:ascii="Times New Roman" w:hAnsi="Times New Roman" w:cs="Times New Roman"/>
+              </w:rPr>
               <w:t>{$</w:t>
             </w:r>
             <w:r>
+              <w:rPr>
+                <w:rFonts w:ascii="Times New Roman" w:hAnsi="Times New Roman" w:cs="Times New Roman"/>
+              </w:rPr>
               <w:t>s2</w:t>
             </w:r>
             <w:r>
+              <w:rPr>
+                <w:rFonts w:ascii="Times New Roman" w:hAnsi="Times New Roman" w:cs="Times New Roman"/>
+              </w:rPr>
               <w:t>_pe_cond$}</w:t>
             </w:r>
           </w:p>
@@ -3807,12 +3926,21 @@
               <w:spacing w:after="0" w:line="240" w:lineRule="auto"/>
             </w:pPr>
             <w:r>
+              <w:rPr>
+                <w:rFonts w:ascii="Times New Roman" w:hAnsi="Times New Roman" w:cs="Times New Roman"/>
+              </w:rPr>
               <w:t>{$</w:t>
             </w:r>
             <w:r>
+              <w:rPr>
+                <w:rFonts w:ascii="Times New Roman" w:hAnsi="Times New Roman" w:cs="Times New Roman"/>
+              </w:rPr>
               <w:t>s2</w:t>
             </w:r>
             <w:r>
+              <w:rPr>
+                <w:rFonts w:ascii="Times New Roman" w:hAnsi="Times New Roman" w:cs="Times New Roman"/>
+              </w:rPr>
               <w:t>_lb_est$}</w:t>
             </w:r>
           </w:p>
@@ -4105,26 +4233,47 @@
               <w:spacing w:after="0" w:line="240" w:lineRule="auto"/>
             </w:pPr>
             <w:r>
+              <w:rPr>
+                <w:rFonts w:ascii="Times New Roman" w:hAnsi="Times New Roman" w:cs="Times New Roman"/>
+              </w:rPr>
               <w:t>{$</w:t>
             </w:r>
             <w:r>
+              <w:rPr>
+                <w:rFonts w:ascii="Times New Roman" w:hAnsi="Times New Roman" w:cs="Times New Roman"/>
+              </w:rPr>
               <w:t>s2</w:t>
             </w:r>
             <w:r>
+              <w:rPr>
+                <w:rFonts w:ascii="Times New Roman" w:hAnsi="Times New Roman" w:cs="Times New Roman"/>
+              </w:rPr>
               <w:t>_smt1_est</w:t>
             </w:r>
             <w:proofErr w:type="gramStart"/>
             <w:r>
-              <w:t>$}/{</w:t>
+              <w:rPr>
+                <w:rFonts w:ascii="Times New Roman" w:hAnsi="Times New Roman" w:cs="Times New Roman"/>
+              </w:rPr>
+              <w:t>$} / {</w:t>
             </w:r>
             <w:proofErr w:type="gramEnd"/>
             <w:r>
+              <w:rPr>
+                <w:rFonts w:ascii="Times New Roman" w:hAnsi="Times New Roman" w:cs="Times New Roman"/>
+              </w:rPr>
               <w:t>$</w:t>
             </w:r>
             <w:r>
+              <w:rPr>
+                <w:rFonts w:ascii="Times New Roman" w:hAnsi="Times New Roman" w:cs="Times New Roman"/>
+              </w:rPr>
               <w:t>s2</w:t>
             </w:r>
             <w:r>
+              <w:rPr>
+                <w:rFonts w:ascii="Times New Roman" w:hAnsi="Times New Roman" w:cs="Times New Roman"/>
+              </w:rPr>
               <w:t>_smt1_ayu$}</w:t>
             </w:r>
           </w:p>
@@ -4310,26 +4459,47 @@
               <w:spacing w:after="0" w:line="240" w:lineRule="auto"/>
             </w:pPr>
             <w:r>
+              <w:rPr>
+                <w:rFonts w:ascii="Times New Roman" w:hAnsi="Times New Roman" w:cs="Times New Roman"/>
+              </w:rPr>
               <w:t>{$</w:t>
             </w:r>
             <w:r>
+              <w:rPr>
+                <w:rFonts w:ascii="Times New Roman" w:hAnsi="Times New Roman" w:cs="Times New Roman"/>
+              </w:rPr>
               <w:t>s2</w:t>
             </w:r>
             <w:r>
+              <w:rPr>
+                <w:rFonts w:ascii="Times New Roman" w:hAnsi="Times New Roman" w:cs="Times New Roman"/>
+              </w:rPr>
               <w:t>_smt2_est</w:t>
             </w:r>
             <w:proofErr w:type="gramStart"/>
             <w:r>
-              <w:t>$}/{</w:t>
+              <w:rPr>
+                <w:rFonts w:ascii="Times New Roman" w:hAnsi="Times New Roman" w:cs="Times New Roman"/>
+              </w:rPr>
+              <w:t>$} / {</w:t>
             </w:r>
             <w:proofErr w:type="gramEnd"/>
             <w:r>
+              <w:rPr>
+                <w:rFonts w:ascii="Times New Roman" w:hAnsi="Times New Roman" w:cs="Times New Roman"/>
+              </w:rPr>
               <w:t>$</w:t>
             </w:r>
             <w:r>
+              <w:rPr>
+                <w:rFonts w:ascii="Times New Roman" w:hAnsi="Times New Roman" w:cs="Times New Roman"/>
+              </w:rPr>
               <w:t>s2</w:t>
             </w:r>
             <w:r>
+              <w:rPr>
+                <w:rFonts w:ascii="Times New Roman" w:hAnsi="Times New Roman" w:cs="Times New Roman"/>
+              </w:rPr>
               <w:t>_smt2_ayu$}</w:t>
             </w:r>
           </w:p>
@@ -4515,26 +4685,47 @@
               <w:spacing w:after="0" w:line="240" w:lineRule="auto"/>
             </w:pPr>
             <w:r>
+              <w:rPr>
+                <w:rFonts w:ascii="Times New Roman" w:hAnsi="Times New Roman" w:cs="Times New Roman"/>
+              </w:rPr>
               <w:t>{$</w:t>
             </w:r>
             <w:r>
+              <w:rPr>
+                <w:rFonts w:ascii="Times New Roman" w:hAnsi="Times New Roman" w:cs="Times New Roman"/>
+              </w:rPr>
               <w:t>s2</w:t>
             </w:r>
             <w:r>
+              <w:rPr>
+                <w:rFonts w:ascii="Times New Roman" w:hAnsi="Times New Roman" w:cs="Times New Roman"/>
+              </w:rPr>
               <w:t>_smt3_est</w:t>
             </w:r>
             <w:proofErr w:type="gramStart"/>
             <w:r>
-              <w:t>$}/{</w:t>
+              <w:rPr>
+                <w:rFonts w:ascii="Times New Roman" w:hAnsi="Times New Roman" w:cs="Times New Roman"/>
+              </w:rPr>
+              <w:t>$} / {</w:t>
             </w:r>
             <w:proofErr w:type="gramEnd"/>
             <w:r>
+              <w:rPr>
+                <w:rFonts w:ascii="Times New Roman" w:hAnsi="Times New Roman" w:cs="Times New Roman"/>
+              </w:rPr>
               <w:t>$</w:t>
             </w:r>
             <w:r>
+              <w:rPr>
+                <w:rFonts w:ascii="Times New Roman" w:hAnsi="Times New Roman" w:cs="Times New Roman"/>
+              </w:rPr>
               <w:t>s2</w:t>
             </w:r>
             <w:r>
+              <w:rPr>
+                <w:rFonts w:ascii="Times New Roman" w:hAnsi="Times New Roman" w:cs="Times New Roman"/>
+              </w:rPr>
               <w:t>_smt3_ayu$}</w:t>
             </w:r>
           </w:p>
@@ -4718,26 +4909,47 @@
               <w:spacing w:after="0" w:line="240" w:lineRule="auto"/>
             </w:pPr>
             <w:r>
+              <w:rPr>
+                <w:rFonts w:ascii="Times New Roman" w:hAnsi="Times New Roman" w:cs="Times New Roman"/>
+              </w:rPr>
               <w:t>{$</w:t>
             </w:r>
             <w:r>
+              <w:rPr>
+                <w:rFonts w:ascii="Times New Roman" w:hAnsi="Times New Roman" w:cs="Times New Roman"/>
+              </w:rPr>
               <w:t>s2</w:t>
             </w:r>
             <w:r>
+              <w:rPr>
+                <w:rFonts w:ascii="Times New Roman" w:hAnsi="Times New Roman" w:cs="Times New Roman"/>
+              </w:rPr>
               <w:t>_smt4_est</w:t>
             </w:r>
             <w:proofErr w:type="gramStart"/>
             <w:r>
-              <w:t>$}/{</w:t>
+              <w:rPr>
+                <w:rFonts w:ascii="Times New Roman" w:hAnsi="Times New Roman" w:cs="Times New Roman"/>
+              </w:rPr>
+              <w:t>$} / {</w:t>
             </w:r>
             <w:proofErr w:type="gramEnd"/>
             <w:r>
+              <w:rPr>
+                <w:rFonts w:ascii="Times New Roman" w:hAnsi="Times New Roman" w:cs="Times New Roman"/>
+              </w:rPr>
               <w:t>$</w:t>
             </w:r>
             <w:r>
+              <w:rPr>
+                <w:rFonts w:ascii="Times New Roman" w:hAnsi="Times New Roman" w:cs="Times New Roman"/>
+              </w:rPr>
               <w:t>s2</w:t>
             </w:r>
             <w:r>
+              <w:rPr>
+                <w:rFonts w:ascii="Times New Roman" w:hAnsi="Times New Roman" w:cs="Times New Roman"/>
+              </w:rPr>
               <w:t>_smt4_ayu$}</w:t>
             </w:r>
           </w:p>
@@ -5069,12 +5281,21 @@
               <w:spacing w:after="0" w:line="240" w:lineRule="auto"/>
             </w:pPr>
             <w:r>
+              <w:rPr>
+                <w:rFonts w:ascii="Times New Roman" w:hAnsi="Times New Roman" w:cs="Times New Roman"/>
+              </w:rPr>
               <w:t>{$</w:t>
             </w:r>
             <w:r>
+              <w:rPr>
+                <w:rFonts w:ascii="Times New Roman" w:hAnsi="Times New Roman" w:cs="Times New Roman"/>
+              </w:rPr>
               <w:t>s2</w:t>
             </w:r>
             <w:r>
+              <w:rPr>
+                <w:rFonts w:ascii="Times New Roman" w:hAnsi="Times New Roman" w:cs="Times New Roman"/>
+              </w:rPr>
               <w:t>_vc1_cond$}</w:t>
             </w:r>
           </w:p>
@@ -5226,12 +5447,21 @@
               <w:spacing w:after="0" w:line="240" w:lineRule="auto"/>
             </w:pPr>
             <w:r>
+              <w:rPr>
+                <w:rFonts w:ascii="Times New Roman" w:hAnsi="Times New Roman" w:cs="Times New Roman"/>
+              </w:rPr>
               <w:t>{$</w:t>
             </w:r>
             <w:r>
+              <w:rPr>
+                <w:rFonts w:ascii="Times New Roman" w:hAnsi="Times New Roman" w:cs="Times New Roman"/>
+              </w:rPr>
               <w:t>s2</w:t>
             </w:r>
             <w:r>
+              <w:rPr>
+                <w:rFonts w:ascii="Times New Roman" w:hAnsi="Times New Roman" w:cs="Times New Roman"/>
+              </w:rPr>
               <w:t>_vc2_cond$}</w:t>
             </w:r>
           </w:p>
@@ -5404,26 +5634,47 @@
               <w:spacing w:after="0" w:line="240" w:lineRule="auto"/>
             </w:pPr>
             <w:r>
+              <w:rPr>
+                <w:rFonts w:ascii="Times New Roman" w:hAnsi="Times New Roman" w:cs="Times New Roman"/>
+              </w:rPr>
               <w:t>{$</w:t>
             </w:r>
             <w:r>
+              <w:rPr>
+                <w:rFonts w:ascii="Times New Roman" w:hAnsi="Times New Roman" w:cs="Times New Roman"/>
+              </w:rPr>
               <w:t>s2</w:t>
             </w:r>
             <w:r>
+              <w:rPr>
+                <w:rFonts w:ascii="Times New Roman" w:hAnsi="Times New Roman" w:cs="Times New Roman"/>
+              </w:rPr>
               <w:t>_ebc_cond</w:t>
             </w:r>
             <w:proofErr w:type="gramStart"/>
             <w:r>
-              <w:t>$}/{</w:t>
+              <w:rPr>
+                <w:rFonts w:ascii="Times New Roman" w:hAnsi="Times New Roman" w:cs="Times New Roman"/>
+              </w:rPr>
+              <w:t>$} / {</w:t>
             </w:r>
             <w:proofErr w:type="gramEnd"/>
             <w:r>
+              <w:rPr>
+                <w:rFonts w:ascii="Times New Roman" w:hAnsi="Times New Roman" w:cs="Times New Roman"/>
+              </w:rPr>
               <w:t>$</w:t>
             </w:r>
             <w:r>
+              <w:rPr>
+                <w:rFonts w:ascii="Times New Roman" w:hAnsi="Times New Roman" w:cs="Times New Roman"/>
+              </w:rPr>
               <w:t>s2</w:t>
             </w:r>
             <w:r>
+              <w:rPr>
+                <w:rFonts w:ascii="Times New Roman" w:hAnsi="Times New Roman" w:cs="Times New Roman"/>
+              </w:rPr>
               <w:t>_ebc_lect$}</w:t>
             </w:r>
           </w:p>
@@ -5685,12 +5936,21 @@
               <w:spacing w:after="0" w:line="240" w:lineRule="auto"/>
             </w:pPr>
             <w:r>
+              <w:rPr>
+                <w:rFonts w:ascii="Times New Roman" w:hAnsi="Times New Roman" w:cs="Times New Roman"/>
+              </w:rPr>
               <w:t>{$</w:t>
             </w:r>
             <w:r>
+              <w:rPr>
+                <w:rFonts w:ascii="Times New Roman" w:hAnsi="Times New Roman" w:cs="Times New Roman"/>
+              </w:rPr>
               <w:t>s2</w:t>
             </w:r>
             <w:r>
+              <w:rPr>
+                <w:rFonts w:ascii="Times New Roman" w:hAnsi="Times New Roman" w:cs="Times New Roman"/>
+              </w:rPr>
               <w:t>_oracion_ci$}</w:t>
             </w:r>
           </w:p>
@@ -5754,11 +6014,15 @@
               <w:spacing w:after="60" w:line="240" w:lineRule="auto"/>
               <w:rPr>
                 <w:b/>
-              </w:rPr>
-            </w:pPr>
-            <w:r>
-              <w:rPr>
-                <w:b/>
+                <w:sz w:val="28"/>
+                <w:szCs w:val="28"/>
+              </w:rPr>
+            </w:pPr>
+            <w:r>
+              <w:rPr>
+                <w:b/>
+                <w:sz w:val="28"/>
+                <w:szCs w:val="28"/>
               </w:rPr>
               <w:lastRenderedPageBreak/>
               <w:t>{$</w:t>
@@ -5768,6 +6032,8 @@
               <w:rPr>
                 <w:b/>
                 <w:bCs/>
+                <w:sz w:val="28"/>
+                <w:szCs w:val="28"/>
               </w:rPr>
               <w:t>congregacion</w:t>
             </w:r>
@@ -5775,6 +6041,8 @@
             <w:r>
               <w:rPr>
                 <w:b/>
+                <w:sz w:val="28"/>
+                <w:szCs w:val="28"/>
               </w:rPr>
               <w:t>$}</w:t>
             </w:r>
@@ -5860,6 +6128,7 @@
             <w:pPr>
               <w:spacing w:after="0" w:line="240" w:lineRule="auto"/>
               <w:rPr>
+                <w:rFonts w:ascii="Times New Roman" w:hAnsi="Times New Roman" w:cs="Times New Roman"/>
                 <w:b/>
                 <w:color w:val="808080" w:themeColor="background1" w:themeShade="80"/>
                 <w:sz w:val="16"/>
@@ -5869,6 +6138,7 @@
             </w:pPr>
             <w:r>
               <w:rPr>
+                <w:rFonts w:ascii="Times New Roman" w:hAnsi="Times New Roman" w:cs="Times New Roman"/>
                 <w:b/>
                 <w:lang w:val="es-MX"/>
               </w:rPr>
@@ -5876,6 +6146,7 @@
             </w:r>
             <w:r>
               <w:rPr>
+                <w:rFonts w:ascii="Times New Roman" w:hAnsi="Times New Roman" w:cs="Times New Roman"/>
                 <w:b/>
                 <w:lang w:val="es-MX"/>
               </w:rPr>
@@ -5883,6 +6154,7 @@
             </w:r>
             <w:r>
               <w:rPr>
+                <w:rFonts w:ascii="Times New Roman" w:hAnsi="Times New Roman" w:cs="Times New Roman"/>
                 <w:b/>
                 <w:lang w:val="es-MX"/>
               </w:rPr>
@@ -5936,12 +6208,21 @@
               <w:spacing w:after="0" w:line="240" w:lineRule="auto"/>
             </w:pPr>
             <w:r>
+              <w:rPr>
+                <w:rFonts w:ascii="Times New Roman" w:hAnsi="Times New Roman" w:cs="Times New Roman"/>
+              </w:rPr>
               <w:t>{$</w:t>
             </w:r>
             <w:r>
+              <w:rPr>
+                <w:rFonts w:ascii="Times New Roman" w:hAnsi="Times New Roman" w:cs="Times New Roman"/>
+              </w:rPr>
               <w:t>s3</w:t>
             </w:r>
             <w:r>
+              <w:rPr>
+                <w:rFonts w:ascii="Times New Roman" w:hAnsi="Times New Roman" w:cs="Times New Roman"/>
+              </w:rPr>
               <w:t>_presidente$}</w:t>
             </w:r>
           </w:p>
@@ -6096,12 +6377,21 @@
               <w:spacing w:after="0" w:line="240" w:lineRule="auto"/>
             </w:pPr>
             <w:r>
+              <w:rPr>
+                <w:rFonts w:ascii="Times New Roman" w:hAnsi="Times New Roman" w:cs="Times New Roman"/>
+              </w:rPr>
               <w:t>{$</w:t>
             </w:r>
             <w:r>
+              <w:rPr>
+                <w:rFonts w:ascii="Times New Roman" w:hAnsi="Times New Roman" w:cs="Times New Roman"/>
+              </w:rPr>
               <w:t>s3</w:t>
             </w:r>
             <w:r>
+              <w:rPr>
+                <w:rFonts w:ascii="Times New Roman" w:hAnsi="Times New Roman" w:cs="Times New Roman"/>
+              </w:rPr>
               <w:t>_oracion_ap$}</w:t>
             </w:r>
           </w:p>
@@ -6464,12 +6754,21 @@
               <w:spacing w:after="0" w:line="240" w:lineRule="auto"/>
             </w:pPr>
             <w:r>
+              <w:rPr>
+                <w:rFonts w:ascii="Times New Roman" w:hAnsi="Times New Roman" w:cs="Times New Roman"/>
+              </w:rPr>
               <w:t>{$</w:t>
             </w:r>
             <w:r>
+              <w:rPr>
+                <w:rFonts w:ascii="Times New Roman" w:hAnsi="Times New Roman" w:cs="Times New Roman"/>
+              </w:rPr>
               <w:t>s3</w:t>
             </w:r>
             <w:r>
+              <w:rPr>
+                <w:rFonts w:ascii="Times New Roman" w:hAnsi="Times New Roman" w:cs="Times New Roman"/>
+              </w:rPr>
               <w:t>_tb_cond$}</w:t>
             </w:r>
           </w:p>
@@ -6629,12 +6928,21 @@
               <w:spacing w:after="0" w:line="240" w:lineRule="auto"/>
             </w:pPr>
             <w:r>
+              <w:rPr>
+                <w:rFonts w:ascii="Times New Roman" w:hAnsi="Times New Roman" w:cs="Times New Roman"/>
+              </w:rPr>
               <w:t>{$</w:t>
             </w:r>
             <w:r>
+              <w:rPr>
+                <w:rFonts w:ascii="Times New Roman" w:hAnsi="Times New Roman" w:cs="Times New Roman"/>
+              </w:rPr>
               <w:t>s3</w:t>
             </w:r>
             <w:r>
+              <w:rPr>
+                <w:rFonts w:ascii="Times New Roman" w:hAnsi="Times New Roman" w:cs="Times New Roman"/>
+              </w:rPr>
               <w:t>_pe_cond$}</w:t>
             </w:r>
           </w:p>
@@ -6794,12 +7102,21 @@
               <w:spacing w:after="0" w:line="240" w:lineRule="auto"/>
             </w:pPr>
             <w:r>
+              <w:rPr>
+                <w:rFonts w:ascii="Times New Roman" w:hAnsi="Times New Roman" w:cs="Times New Roman"/>
+              </w:rPr>
               <w:t>{$</w:t>
             </w:r>
             <w:r>
+              <w:rPr>
+                <w:rFonts w:ascii="Times New Roman" w:hAnsi="Times New Roman" w:cs="Times New Roman"/>
+              </w:rPr>
               <w:t>s3</w:t>
             </w:r>
             <w:r>
+              <w:rPr>
+                <w:rFonts w:ascii="Times New Roman" w:hAnsi="Times New Roman" w:cs="Times New Roman"/>
+              </w:rPr>
               <w:t>_lb_est$}</w:t>
             </w:r>
           </w:p>
@@ -7092,26 +7409,47 @@
               <w:spacing w:after="0" w:line="240" w:lineRule="auto"/>
             </w:pPr>
             <w:r>
+              <w:rPr>
+                <w:rFonts w:ascii="Times New Roman" w:hAnsi="Times New Roman" w:cs="Times New Roman"/>
+              </w:rPr>
               <w:t>{$</w:t>
             </w:r>
             <w:r>
+              <w:rPr>
+                <w:rFonts w:ascii="Times New Roman" w:hAnsi="Times New Roman" w:cs="Times New Roman"/>
+              </w:rPr>
               <w:t>s3</w:t>
             </w:r>
             <w:r>
+              <w:rPr>
+                <w:rFonts w:ascii="Times New Roman" w:hAnsi="Times New Roman" w:cs="Times New Roman"/>
+              </w:rPr>
               <w:t>_smt1_est</w:t>
             </w:r>
             <w:proofErr w:type="gramStart"/>
             <w:r>
-              <w:t>$}/{</w:t>
+              <w:rPr>
+                <w:rFonts w:ascii="Times New Roman" w:hAnsi="Times New Roman" w:cs="Times New Roman"/>
+              </w:rPr>
+              <w:t>$} / {</w:t>
             </w:r>
             <w:proofErr w:type="gramEnd"/>
             <w:r>
+              <w:rPr>
+                <w:rFonts w:ascii="Times New Roman" w:hAnsi="Times New Roman" w:cs="Times New Roman"/>
+              </w:rPr>
               <w:t>$</w:t>
             </w:r>
             <w:r>
+              <w:rPr>
+                <w:rFonts w:ascii="Times New Roman" w:hAnsi="Times New Roman" w:cs="Times New Roman"/>
+              </w:rPr>
               <w:t>s3</w:t>
             </w:r>
             <w:r>
+              <w:rPr>
+                <w:rFonts w:ascii="Times New Roman" w:hAnsi="Times New Roman" w:cs="Times New Roman"/>
+              </w:rPr>
               <w:t>_smt1_ayu$}</w:t>
             </w:r>
           </w:p>
@@ -7297,26 +7635,47 @@
               <w:spacing w:after="0" w:line="240" w:lineRule="auto"/>
             </w:pPr>
             <w:r>
+              <w:rPr>
+                <w:rFonts w:ascii="Times New Roman" w:hAnsi="Times New Roman" w:cs="Times New Roman"/>
+              </w:rPr>
               <w:t>{$</w:t>
             </w:r>
             <w:r>
+              <w:rPr>
+                <w:rFonts w:ascii="Times New Roman" w:hAnsi="Times New Roman" w:cs="Times New Roman"/>
+              </w:rPr>
               <w:t>s3</w:t>
             </w:r>
             <w:r>
+              <w:rPr>
+                <w:rFonts w:ascii="Times New Roman" w:hAnsi="Times New Roman" w:cs="Times New Roman"/>
+              </w:rPr>
               <w:t>_smt2_est</w:t>
             </w:r>
             <w:proofErr w:type="gramStart"/>
             <w:r>
-              <w:t>$}/{</w:t>
+              <w:rPr>
+                <w:rFonts w:ascii="Times New Roman" w:hAnsi="Times New Roman" w:cs="Times New Roman"/>
+              </w:rPr>
+              <w:t>$} / {</w:t>
             </w:r>
             <w:proofErr w:type="gramEnd"/>
             <w:r>
+              <w:rPr>
+                <w:rFonts w:ascii="Times New Roman" w:hAnsi="Times New Roman" w:cs="Times New Roman"/>
+              </w:rPr>
               <w:t>$</w:t>
             </w:r>
             <w:r>
+              <w:rPr>
+                <w:rFonts w:ascii="Times New Roman" w:hAnsi="Times New Roman" w:cs="Times New Roman"/>
+              </w:rPr>
               <w:t>s3</w:t>
             </w:r>
             <w:r>
+              <w:rPr>
+                <w:rFonts w:ascii="Times New Roman" w:hAnsi="Times New Roman" w:cs="Times New Roman"/>
+              </w:rPr>
               <w:t>_smt2_ayu$}</w:t>
             </w:r>
           </w:p>
@@ -7502,26 +7861,47 @@
               <w:spacing w:after="0" w:line="240" w:lineRule="auto"/>
             </w:pPr>
             <w:r>
+              <w:rPr>
+                <w:rFonts w:ascii="Times New Roman" w:hAnsi="Times New Roman" w:cs="Times New Roman"/>
+              </w:rPr>
               <w:t>{$</w:t>
             </w:r>
             <w:r>
+              <w:rPr>
+                <w:rFonts w:ascii="Times New Roman" w:hAnsi="Times New Roman" w:cs="Times New Roman"/>
+              </w:rPr>
               <w:t>s3</w:t>
             </w:r>
             <w:r>
+              <w:rPr>
+                <w:rFonts w:ascii="Times New Roman" w:hAnsi="Times New Roman" w:cs="Times New Roman"/>
+              </w:rPr>
               <w:t>_smt3_est</w:t>
             </w:r>
             <w:proofErr w:type="gramStart"/>
             <w:r>
-              <w:t>$}/{</w:t>
+              <w:rPr>
+                <w:rFonts w:ascii="Times New Roman" w:hAnsi="Times New Roman" w:cs="Times New Roman"/>
+              </w:rPr>
+              <w:t>$} / {</w:t>
             </w:r>
             <w:proofErr w:type="gramEnd"/>
             <w:r>
+              <w:rPr>
+                <w:rFonts w:ascii="Times New Roman" w:hAnsi="Times New Roman" w:cs="Times New Roman"/>
+              </w:rPr>
               <w:t>$</w:t>
             </w:r>
             <w:r>
+              <w:rPr>
+                <w:rFonts w:ascii="Times New Roman" w:hAnsi="Times New Roman" w:cs="Times New Roman"/>
+              </w:rPr>
               <w:t>s3</w:t>
             </w:r>
             <w:r>
+              <w:rPr>
+                <w:rFonts w:ascii="Times New Roman" w:hAnsi="Times New Roman" w:cs="Times New Roman"/>
+              </w:rPr>
               <w:t>_smt3_ayu$}</w:t>
             </w:r>
           </w:p>
@@ -7705,26 +8085,47 @@
               <w:spacing w:after="0" w:line="240" w:lineRule="auto"/>
             </w:pPr>
             <w:r>
+              <w:rPr>
+                <w:rFonts w:ascii="Times New Roman" w:hAnsi="Times New Roman" w:cs="Times New Roman"/>
+              </w:rPr>
               <w:t>{$</w:t>
             </w:r>
             <w:r>
+              <w:rPr>
+                <w:rFonts w:ascii="Times New Roman" w:hAnsi="Times New Roman" w:cs="Times New Roman"/>
+              </w:rPr>
               <w:t>s3</w:t>
             </w:r>
             <w:r>
+              <w:rPr>
+                <w:rFonts w:ascii="Times New Roman" w:hAnsi="Times New Roman" w:cs="Times New Roman"/>
+              </w:rPr>
               <w:t>_smt4_est</w:t>
             </w:r>
             <w:proofErr w:type="gramStart"/>
             <w:r>
-              <w:t>$}/{</w:t>
+              <w:rPr>
+                <w:rFonts w:ascii="Times New Roman" w:hAnsi="Times New Roman" w:cs="Times New Roman"/>
+              </w:rPr>
+              <w:t>$} / {</w:t>
             </w:r>
             <w:proofErr w:type="gramEnd"/>
             <w:r>
+              <w:rPr>
+                <w:rFonts w:ascii="Times New Roman" w:hAnsi="Times New Roman" w:cs="Times New Roman"/>
+              </w:rPr>
               <w:t>$</w:t>
             </w:r>
             <w:r>
+              <w:rPr>
+                <w:rFonts w:ascii="Times New Roman" w:hAnsi="Times New Roman" w:cs="Times New Roman"/>
+              </w:rPr>
               <w:t>s3</w:t>
             </w:r>
             <w:r>
+              <w:rPr>
+                <w:rFonts w:ascii="Times New Roman" w:hAnsi="Times New Roman" w:cs="Times New Roman"/>
+              </w:rPr>
               <w:t>_smt4_ayu$}</w:t>
             </w:r>
           </w:p>
@@ -8056,12 +8457,21 @@
               <w:spacing w:after="0" w:line="240" w:lineRule="auto"/>
             </w:pPr>
             <w:r>
+              <w:rPr>
+                <w:rFonts w:ascii="Times New Roman" w:hAnsi="Times New Roman" w:cs="Times New Roman"/>
+              </w:rPr>
               <w:t>{$</w:t>
             </w:r>
             <w:r>
+              <w:rPr>
+                <w:rFonts w:ascii="Times New Roman" w:hAnsi="Times New Roman" w:cs="Times New Roman"/>
+              </w:rPr>
               <w:t>s3</w:t>
             </w:r>
             <w:r>
+              <w:rPr>
+                <w:rFonts w:ascii="Times New Roman" w:hAnsi="Times New Roman" w:cs="Times New Roman"/>
+              </w:rPr>
               <w:t>_vc1_cond$}</w:t>
             </w:r>
           </w:p>
@@ -8213,12 +8623,21 @@
               <w:spacing w:after="0" w:line="240" w:lineRule="auto"/>
             </w:pPr>
             <w:r>
+              <w:rPr>
+                <w:rFonts w:ascii="Times New Roman" w:hAnsi="Times New Roman" w:cs="Times New Roman"/>
+              </w:rPr>
               <w:t>{$</w:t>
             </w:r>
             <w:r>
+              <w:rPr>
+                <w:rFonts w:ascii="Times New Roman" w:hAnsi="Times New Roman" w:cs="Times New Roman"/>
+              </w:rPr>
               <w:t>s3</w:t>
             </w:r>
             <w:r>
+              <w:rPr>
+                <w:rFonts w:ascii="Times New Roman" w:hAnsi="Times New Roman" w:cs="Times New Roman"/>
+              </w:rPr>
               <w:t>_vc2_cond$}</w:t>
             </w:r>
           </w:p>
@@ -8391,26 +8810,47 @@
               <w:spacing w:after="0" w:line="240" w:lineRule="auto"/>
             </w:pPr>
             <w:r>
+              <w:rPr>
+                <w:rFonts w:ascii="Times New Roman" w:hAnsi="Times New Roman" w:cs="Times New Roman"/>
+              </w:rPr>
               <w:t>{$</w:t>
             </w:r>
             <w:r>
+              <w:rPr>
+                <w:rFonts w:ascii="Times New Roman" w:hAnsi="Times New Roman" w:cs="Times New Roman"/>
+              </w:rPr>
               <w:t>s3</w:t>
             </w:r>
             <w:r>
+              <w:rPr>
+                <w:rFonts w:ascii="Times New Roman" w:hAnsi="Times New Roman" w:cs="Times New Roman"/>
+              </w:rPr>
               <w:t>_ebc_cond</w:t>
             </w:r>
             <w:proofErr w:type="gramStart"/>
             <w:r>
-              <w:t>$}/{</w:t>
+              <w:rPr>
+                <w:rFonts w:ascii="Times New Roman" w:hAnsi="Times New Roman" w:cs="Times New Roman"/>
+              </w:rPr>
+              <w:t>$} / {</w:t>
             </w:r>
             <w:proofErr w:type="gramEnd"/>
             <w:r>
+              <w:rPr>
+                <w:rFonts w:ascii="Times New Roman" w:hAnsi="Times New Roman" w:cs="Times New Roman"/>
+              </w:rPr>
               <w:t>$</w:t>
             </w:r>
             <w:r>
+              <w:rPr>
+                <w:rFonts w:ascii="Times New Roman" w:hAnsi="Times New Roman" w:cs="Times New Roman"/>
+              </w:rPr>
               <w:t>s3</w:t>
             </w:r>
             <w:r>
+              <w:rPr>
+                <w:rFonts w:ascii="Times New Roman" w:hAnsi="Times New Roman" w:cs="Times New Roman"/>
+              </w:rPr>
               <w:t>_ebc_lect$}</w:t>
             </w:r>
           </w:p>
@@ -8672,12 +9112,21 @@
               <w:spacing w:after="0" w:line="240" w:lineRule="auto"/>
             </w:pPr>
             <w:r>
+              <w:rPr>
+                <w:rFonts w:ascii="Times New Roman" w:hAnsi="Times New Roman" w:cs="Times New Roman"/>
+              </w:rPr>
               <w:t>{$</w:t>
             </w:r>
             <w:r>
+              <w:rPr>
+                <w:rFonts w:ascii="Times New Roman" w:hAnsi="Times New Roman" w:cs="Times New Roman"/>
+              </w:rPr>
               <w:t>s3</w:t>
             </w:r>
             <w:r>
+              <w:rPr>
+                <w:rFonts w:ascii="Times New Roman" w:hAnsi="Times New Roman" w:cs="Times New Roman"/>
+              </w:rPr>
               <w:t>_oracion_ci$}</w:t>
             </w:r>
           </w:p>
@@ -8771,6 +9220,7 @@
             <w:pPr>
               <w:spacing w:after="0" w:line="240" w:lineRule="auto"/>
               <w:rPr>
+                <w:rFonts w:ascii="Times New Roman" w:hAnsi="Times New Roman" w:cs="Times New Roman"/>
                 <w:b/>
                 <w:color w:val="808080" w:themeColor="background1" w:themeShade="80"/>
                 <w:sz w:val="16"/>
@@ -8780,6 +9230,7 @@
             </w:pPr>
             <w:r>
               <w:rPr>
+                <w:rFonts w:ascii="Times New Roman" w:hAnsi="Times New Roman" w:cs="Times New Roman"/>
                 <w:b/>
                 <w:lang w:val="es-MX"/>
               </w:rPr>
@@ -8787,6 +9238,7 @@
             </w:r>
             <w:r>
               <w:rPr>
+                <w:rFonts w:ascii="Times New Roman" w:hAnsi="Times New Roman" w:cs="Times New Roman"/>
                 <w:b/>
                 <w:lang w:val="es-MX"/>
               </w:rPr>
@@ -8794,6 +9246,7 @@
             </w:r>
             <w:r>
               <w:rPr>
+                <w:rFonts w:ascii="Times New Roman" w:hAnsi="Times New Roman" w:cs="Times New Roman"/>
                 <w:b/>
                 <w:lang w:val="es-MX"/>
               </w:rPr>
@@ -8847,12 +9300,21 @@
               <w:spacing w:after="0" w:line="240" w:lineRule="auto"/>
             </w:pPr>
             <w:r>
+              <w:rPr>
+                <w:rFonts w:ascii="Times New Roman" w:hAnsi="Times New Roman" w:cs="Times New Roman"/>
+              </w:rPr>
               <w:t>{$</w:t>
             </w:r>
             <w:r>
+              <w:rPr>
+                <w:rFonts w:ascii="Times New Roman" w:hAnsi="Times New Roman" w:cs="Times New Roman"/>
+              </w:rPr>
               <w:t>s4</w:t>
             </w:r>
             <w:r>
+              <w:rPr>
+                <w:rFonts w:ascii="Times New Roman" w:hAnsi="Times New Roman" w:cs="Times New Roman"/>
+              </w:rPr>
               <w:t>_presidente$}</w:t>
             </w:r>
           </w:p>
@@ -9007,12 +9469,21 @@
               <w:spacing w:after="0" w:line="240" w:lineRule="auto"/>
             </w:pPr>
             <w:r>
+              <w:rPr>
+                <w:rFonts w:ascii="Times New Roman" w:hAnsi="Times New Roman" w:cs="Times New Roman"/>
+              </w:rPr>
               <w:t>{$</w:t>
             </w:r>
             <w:r>
+              <w:rPr>
+                <w:rFonts w:ascii="Times New Roman" w:hAnsi="Times New Roman" w:cs="Times New Roman"/>
+              </w:rPr>
               <w:t>s4</w:t>
             </w:r>
             <w:r>
+              <w:rPr>
+                <w:rFonts w:ascii="Times New Roman" w:hAnsi="Times New Roman" w:cs="Times New Roman"/>
+              </w:rPr>
               <w:t>_oracion_ap$}</w:t>
             </w:r>
           </w:p>
@@ -9375,12 +9846,21 @@
               <w:spacing w:after="0" w:line="240" w:lineRule="auto"/>
             </w:pPr>
             <w:r>
+              <w:rPr>
+                <w:rFonts w:ascii="Times New Roman" w:hAnsi="Times New Roman" w:cs="Times New Roman"/>
+              </w:rPr>
               <w:t>{$</w:t>
             </w:r>
             <w:r>
+              <w:rPr>
+                <w:rFonts w:ascii="Times New Roman" w:hAnsi="Times New Roman" w:cs="Times New Roman"/>
+              </w:rPr>
               <w:t>s4</w:t>
             </w:r>
             <w:r>
+              <w:rPr>
+                <w:rFonts w:ascii="Times New Roman" w:hAnsi="Times New Roman" w:cs="Times New Roman"/>
+              </w:rPr>
               <w:t>_tb_cond$}</w:t>
             </w:r>
           </w:p>
@@ -9540,12 +10020,21 @@
               <w:spacing w:after="0" w:line="240" w:lineRule="auto"/>
             </w:pPr>
             <w:r>
+              <w:rPr>
+                <w:rFonts w:ascii="Times New Roman" w:hAnsi="Times New Roman" w:cs="Times New Roman"/>
+              </w:rPr>
               <w:t>{$</w:t>
             </w:r>
             <w:r>
+              <w:rPr>
+                <w:rFonts w:ascii="Times New Roman" w:hAnsi="Times New Roman" w:cs="Times New Roman"/>
+              </w:rPr>
               <w:t>s4</w:t>
             </w:r>
             <w:r>
+              <w:rPr>
+                <w:rFonts w:ascii="Times New Roman" w:hAnsi="Times New Roman" w:cs="Times New Roman"/>
+              </w:rPr>
               <w:t>_pe_cond$}</w:t>
             </w:r>
           </w:p>
@@ -9705,12 +10194,21 @@
               <w:spacing w:after="0" w:line="240" w:lineRule="auto"/>
             </w:pPr>
             <w:r>
+              <w:rPr>
+                <w:rFonts w:ascii="Times New Roman" w:hAnsi="Times New Roman" w:cs="Times New Roman"/>
+              </w:rPr>
               <w:t>{$</w:t>
             </w:r>
             <w:r>
+              <w:rPr>
+                <w:rFonts w:ascii="Times New Roman" w:hAnsi="Times New Roman" w:cs="Times New Roman"/>
+              </w:rPr>
               <w:t>s4</w:t>
             </w:r>
             <w:r>
+              <w:rPr>
+                <w:rFonts w:ascii="Times New Roman" w:hAnsi="Times New Roman" w:cs="Times New Roman"/>
+              </w:rPr>
               <w:t>_lb_est$}</w:t>
             </w:r>
           </w:p>
@@ -10003,26 +10501,47 @@
               <w:spacing w:after="0" w:line="240" w:lineRule="auto"/>
             </w:pPr>
             <w:r>
+              <w:rPr>
+                <w:rFonts w:ascii="Times New Roman" w:hAnsi="Times New Roman" w:cs="Times New Roman"/>
+              </w:rPr>
               <w:t>{$</w:t>
             </w:r>
             <w:r>
+              <w:rPr>
+                <w:rFonts w:ascii="Times New Roman" w:hAnsi="Times New Roman" w:cs="Times New Roman"/>
+              </w:rPr>
               <w:t>s4</w:t>
             </w:r>
             <w:r>
+              <w:rPr>
+                <w:rFonts w:ascii="Times New Roman" w:hAnsi="Times New Roman" w:cs="Times New Roman"/>
+              </w:rPr>
               <w:t>_smt1_est</w:t>
             </w:r>
             <w:proofErr w:type="gramStart"/>
             <w:r>
-              <w:t>$}/{</w:t>
+              <w:rPr>
+                <w:rFonts w:ascii="Times New Roman" w:hAnsi="Times New Roman" w:cs="Times New Roman"/>
+              </w:rPr>
+              <w:t>$} / {</w:t>
             </w:r>
             <w:proofErr w:type="gramEnd"/>
             <w:r>
+              <w:rPr>
+                <w:rFonts w:ascii="Times New Roman" w:hAnsi="Times New Roman" w:cs="Times New Roman"/>
+              </w:rPr>
               <w:t>$</w:t>
             </w:r>
             <w:r>
+              <w:rPr>
+                <w:rFonts w:ascii="Times New Roman" w:hAnsi="Times New Roman" w:cs="Times New Roman"/>
+              </w:rPr>
               <w:t>s4</w:t>
             </w:r>
             <w:r>
+              <w:rPr>
+                <w:rFonts w:ascii="Times New Roman" w:hAnsi="Times New Roman" w:cs="Times New Roman"/>
+              </w:rPr>
               <w:t>_smt1_ayu$}</w:t>
             </w:r>
           </w:p>
@@ -10208,26 +10727,47 @@
               <w:spacing w:after="0" w:line="240" w:lineRule="auto"/>
             </w:pPr>
             <w:r>
+              <w:rPr>
+                <w:rFonts w:ascii="Times New Roman" w:hAnsi="Times New Roman" w:cs="Times New Roman"/>
+              </w:rPr>
               <w:t>{$</w:t>
             </w:r>
             <w:r>
+              <w:rPr>
+                <w:rFonts w:ascii="Times New Roman" w:hAnsi="Times New Roman" w:cs="Times New Roman"/>
+              </w:rPr>
               <w:t>s4</w:t>
             </w:r>
             <w:r>
+              <w:rPr>
+                <w:rFonts w:ascii="Times New Roman" w:hAnsi="Times New Roman" w:cs="Times New Roman"/>
+              </w:rPr>
               <w:t>_smt2_est</w:t>
             </w:r>
             <w:proofErr w:type="gramStart"/>
             <w:r>
-              <w:t>$}/{</w:t>
+              <w:rPr>
+                <w:rFonts w:ascii="Times New Roman" w:hAnsi="Times New Roman" w:cs="Times New Roman"/>
+              </w:rPr>
+              <w:t>$} / {</w:t>
             </w:r>
             <w:proofErr w:type="gramEnd"/>
             <w:r>
+              <w:rPr>
+                <w:rFonts w:ascii="Times New Roman" w:hAnsi="Times New Roman" w:cs="Times New Roman"/>
+              </w:rPr>
               <w:t>$</w:t>
             </w:r>
             <w:r>
+              <w:rPr>
+                <w:rFonts w:ascii="Times New Roman" w:hAnsi="Times New Roman" w:cs="Times New Roman"/>
+              </w:rPr>
               <w:t>s4</w:t>
             </w:r>
             <w:r>
+              <w:rPr>
+                <w:rFonts w:ascii="Times New Roman" w:hAnsi="Times New Roman" w:cs="Times New Roman"/>
+              </w:rPr>
               <w:t>_smt2_ayu$}</w:t>
             </w:r>
           </w:p>
@@ -10413,26 +10953,47 @@
               <w:spacing w:after="0" w:line="240" w:lineRule="auto"/>
             </w:pPr>
             <w:r>
+              <w:rPr>
+                <w:rFonts w:ascii="Times New Roman" w:hAnsi="Times New Roman" w:cs="Times New Roman"/>
+              </w:rPr>
               <w:t>{$</w:t>
             </w:r>
             <w:r>
+              <w:rPr>
+                <w:rFonts w:ascii="Times New Roman" w:hAnsi="Times New Roman" w:cs="Times New Roman"/>
+              </w:rPr>
               <w:t>s4</w:t>
             </w:r>
             <w:r>
+              <w:rPr>
+                <w:rFonts w:ascii="Times New Roman" w:hAnsi="Times New Roman" w:cs="Times New Roman"/>
+              </w:rPr>
               <w:t>_smt3_est</w:t>
             </w:r>
             <w:proofErr w:type="gramStart"/>
             <w:r>
-              <w:t>$}/{</w:t>
+              <w:rPr>
+                <w:rFonts w:ascii="Times New Roman" w:hAnsi="Times New Roman" w:cs="Times New Roman"/>
+              </w:rPr>
+              <w:t>$} / {</w:t>
             </w:r>
             <w:proofErr w:type="gramEnd"/>
             <w:r>
+              <w:rPr>
+                <w:rFonts w:ascii="Times New Roman" w:hAnsi="Times New Roman" w:cs="Times New Roman"/>
+              </w:rPr>
               <w:t>$</w:t>
             </w:r>
             <w:r>
+              <w:rPr>
+                <w:rFonts w:ascii="Times New Roman" w:hAnsi="Times New Roman" w:cs="Times New Roman"/>
+              </w:rPr>
               <w:t>s4</w:t>
             </w:r>
             <w:r>
+              <w:rPr>
+                <w:rFonts w:ascii="Times New Roman" w:hAnsi="Times New Roman" w:cs="Times New Roman"/>
+              </w:rPr>
               <w:t>_smt3_ayu$}</w:t>
             </w:r>
           </w:p>
@@ -10616,26 +11177,47 @@
               <w:spacing w:after="0" w:line="240" w:lineRule="auto"/>
             </w:pPr>
             <w:r>
+              <w:rPr>
+                <w:rFonts w:ascii="Times New Roman" w:hAnsi="Times New Roman" w:cs="Times New Roman"/>
+              </w:rPr>
               <w:t>{$</w:t>
             </w:r>
             <w:r>
+              <w:rPr>
+                <w:rFonts w:ascii="Times New Roman" w:hAnsi="Times New Roman" w:cs="Times New Roman"/>
+              </w:rPr>
               <w:t>s4</w:t>
             </w:r>
             <w:r>
+              <w:rPr>
+                <w:rFonts w:ascii="Times New Roman" w:hAnsi="Times New Roman" w:cs="Times New Roman"/>
+              </w:rPr>
               <w:t>_smt4_est</w:t>
             </w:r>
             <w:proofErr w:type="gramStart"/>
             <w:r>
-              <w:t>$}/{</w:t>
+              <w:rPr>
+                <w:rFonts w:ascii="Times New Roman" w:hAnsi="Times New Roman" w:cs="Times New Roman"/>
+              </w:rPr>
+              <w:t>$} / {</w:t>
             </w:r>
             <w:proofErr w:type="gramEnd"/>
             <w:r>
+              <w:rPr>
+                <w:rFonts w:ascii="Times New Roman" w:hAnsi="Times New Roman" w:cs="Times New Roman"/>
+              </w:rPr>
               <w:t>$</w:t>
             </w:r>
             <w:r>
+              <w:rPr>
+                <w:rFonts w:ascii="Times New Roman" w:hAnsi="Times New Roman" w:cs="Times New Roman"/>
+              </w:rPr>
               <w:t>s4</w:t>
             </w:r>
             <w:r>
+              <w:rPr>
+                <w:rFonts w:ascii="Times New Roman" w:hAnsi="Times New Roman" w:cs="Times New Roman"/>
+              </w:rPr>
               <w:t>_smt4_ayu$}</w:t>
             </w:r>
           </w:p>
@@ -10967,12 +11549,21 @@
               <w:spacing w:after="0" w:line="240" w:lineRule="auto"/>
             </w:pPr>
             <w:r>
+              <w:rPr>
+                <w:rFonts w:ascii="Times New Roman" w:hAnsi="Times New Roman" w:cs="Times New Roman"/>
+              </w:rPr>
               <w:t>{$</w:t>
             </w:r>
             <w:r>
+              <w:rPr>
+                <w:rFonts w:ascii="Times New Roman" w:hAnsi="Times New Roman" w:cs="Times New Roman"/>
+              </w:rPr>
               <w:t>s4</w:t>
             </w:r>
             <w:r>
+              <w:rPr>
+                <w:rFonts w:ascii="Times New Roman" w:hAnsi="Times New Roman" w:cs="Times New Roman"/>
+              </w:rPr>
               <w:t>_vc1_cond$}</w:t>
             </w:r>
           </w:p>
@@ -11124,12 +11715,21 @@
               <w:spacing w:after="0" w:line="240" w:lineRule="auto"/>
             </w:pPr>
             <w:r>
+              <w:rPr>
+                <w:rFonts w:ascii="Times New Roman" w:hAnsi="Times New Roman" w:cs="Times New Roman"/>
+              </w:rPr>
               <w:t>{$</w:t>
             </w:r>
             <w:r>
+              <w:rPr>
+                <w:rFonts w:ascii="Times New Roman" w:hAnsi="Times New Roman" w:cs="Times New Roman"/>
+              </w:rPr>
               <w:t>s4</w:t>
             </w:r>
             <w:r>
+              <w:rPr>
+                <w:rFonts w:ascii="Times New Roman" w:hAnsi="Times New Roman" w:cs="Times New Roman"/>
+              </w:rPr>
               <w:t>_vc2_cond$}</w:t>
             </w:r>
           </w:p>
@@ -11302,26 +11902,47 @@
               <w:spacing w:after="0" w:line="240" w:lineRule="auto"/>
             </w:pPr>
             <w:r>
+              <w:rPr>
+                <w:rFonts w:ascii="Times New Roman" w:hAnsi="Times New Roman" w:cs="Times New Roman"/>
+              </w:rPr>
               <w:t>{$</w:t>
             </w:r>
             <w:r>
+              <w:rPr>
+                <w:rFonts w:ascii="Times New Roman" w:hAnsi="Times New Roman" w:cs="Times New Roman"/>
+              </w:rPr>
               <w:t>s4</w:t>
             </w:r>
             <w:r>
+              <w:rPr>
+                <w:rFonts w:ascii="Times New Roman" w:hAnsi="Times New Roman" w:cs="Times New Roman"/>
+              </w:rPr>
               <w:t>_ebc_cond</w:t>
             </w:r>
             <w:proofErr w:type="gramStart"/>
             <w:r>
-              <w:t>$}/{</w:t>
+              <w:rPr>
+                <w:rFonts w:ascii="Times New Roman" w:hAnsi="Times New Roman" w:cs="Times New Roman"/>
+              </w:rPr>
+              <w:t>$} / {</w:t>
             </w:r>
             <w:proofErr w:type="gramEnd"/>
             <w:r>
+              <w:rPr>
+                <w:rFonts w:ascii="Times New Roman" w:hAnsi="Times New Roman" w:cs="Times New Roman"/>
+              </w:rPr>
               <w:t>$</w:t>
             </w:r>
             <w:r>
+              <w:rPr>
+                <w:rFonts w:ascii="Times New Roman" w:hAnsi="Times New Roman" w:cs="Times New Roman"/>
+              </w:rPr>
               <w:t>s4</w:t>
             </w:r>
             <w:r>
+              <w:rPr>
+                <w:rFonts w:ascii="Times New Roman" w:hAnsi="Times New Roman" w:cs="Times New Roman"/>
+              </w:rPr>
               <w:t>_ebc_lect$}</w:t>
             </w:r>
           </w:p>
@@ -11583,12 +12204,21 @@
               <w:spacing w:after="0" w:line="240" w:lineRule="auto"/>
             </w:pPr>
             <w:r>
+              <w:rPr>
+                <w:rFonts w:ascii="Times New Roman" w:hAnsi="Times New Roman" w:cs="Times New Roman"/>
+              </w:rPr>
               <w:t>{$</w:t>
             </w:r>
             <w:r>
+              <w:rPr>
+                <w:rFonts w:ascii="Times New Roman" w:hAnsi="Times New Roman" w:cs="Times New Roman"/>
+              </w:rPr>
               <w:t>s4</w:t>
             </w:r>
             <w:r>
+              <w:rPr>
+                <w:rFonts w:ascii="Times New Roman" w:hAnsi="Times New Roman" w:cs="Times New Roman"/>
+              </w:rPr>
               <w:t>_oracion_ci$}</w:t>
             </w:r>
           </w:p>
@@ -11652,11 +12282,15 @@
               <w:spacing w:after="60" w:line="240" w:lineRule="auto"/>
               <w:rPr>
                 <w:b/>
-              </w:rPr>
-            </w:pPr>
-            <w:r>
-              <w:rPr>
-                <w:b/>
+                <w:sz w:val="28"/>
+                <w:szCs w:val="28"/>
+              </w:rPr>
+            </w:pPr>
+            <w:r>
+              <w:rPr>
+                <w:b/>
+                <w:sz w:val="28"/>
+                <w:szCs w:val="28"/>
               </w:rPr>
               <w:lastRenderedPageBreak/>
               <w:t>{$</w:t>
@@ -11666,6 +12300,8 @@
               <w:rPr>
                 <w:b/>
                 <w:bCs/>
+                <w:sz w:val="28"/>
+                <w:szCs w:val="28"/>
               </w:rPr>
               <w:t>congregacion</w:t>
             </w:r>
@@ -11673,6 +12309,8 @@
             <w:r>
               <w:rPr>
                 <w:b/>
+                <w:sz w:val="28"/>
+                <w:szCs w:val="28"/>
               </w:rPr>
               <w:t>$}</w:t>
             </w:r>
@@ -11758,6 +12396,7 @@
             <w:pPr>
               <w:spacing w:after="0" w:line="240" w:lineRule="auto"/>
               <w:rPr>
+                <w:rFonts w:ascii="Times New Roman" w:hAnsi="Times New Roman" w:cs="Times New Roman"/>
                 <w:b/>
                 <w:color w:val="808080" w:themeColor="background1" w:themeShade="80"/>
                 <w:sz w:val="16"/>
@@ -11767,6 +12406,7 @@
             </w:pPr>
             <w:r>
               <w:rPr>
+                <w:rFonts w:ascii="Times New Roman" w:hAnsi="Times New Roman" w:cs="Times New Roman"/>
                 <w:b/>
                 <w:lang w:val="es-MX"/>
               </w:rPr>
@@ -11774,6 +12414,7 @@
             </w:r>
             <w:r>
               <w:rPr>
+                <w:rFonts w:ascii="Times New Roman" w:hAnsi="Times New Roman" w:cs="Times New Roman"/>
                 <w:b/>
                 <w:lang w:val="es-MX"/>
               </w:rPr>
@@ -11781,6 +12422,7 @@
             </w:r>
             <w:r>
               <w:rPr>
+                <w:rFonts w:ascii="Times New Roman" w:hAnsi="Times New Roman" w:cs="Times New Roman"/>
                 <w:b/>
                 <w:lang w:val="es-MX"/>
               </w:rPr>
@@ -11834,12 +12476,21 @@
               <w:spacing w:after="0" w:line="240" w:lineRule="auto"/>
             </w:pPr>
             <w:r>
+              <w:rPr>
+                <w:rFonts w:ascii="Times New Roman" w:hAnsi="Times New Roman" w:cs="Times New Roman"/>
+              </w:rPr>
               <w:t>{$</w:t>
             </w:r>
             <w:r>
+              <w:rPr>
+                <w:rFonts w:ascii="Times New Roman" w:hAnsi="Times New Roman" w:cs="Times New Roman"/>
+              </w:rPr>
               <w:t>s5</w:t>
             </w:r>
             <w:r>
+              <w:rPr>
+                <w:rFonts w:ascii="Times New Roman" w:hAnsi="Times New Roman" w:cs="Times New Roman"/>
+              </w:rPr>
               <w:t>_presidente$}</w:t>
             </w:r>
           </w:p>
@@ -11994,12 +12645,21 @@
               <w:spacing w:after="0" w:line="240" w:lineRule="auto"/>
             </w:pPr>
             <w:r>
+              <w:rPr>
+                <w:rFonts w:ascii="Times New Roman" w:hAnsi="Times New Roman" w:cs="Times New Roman"/>
+              </w:rPr>
               <w:t>{$</w:t>
             </w:r>
             <w:r>
+              <w:rPr>
+                <w:rFonts w:ascii="Times New Roman" w:hAnsi="Times New Roman" w:cs="Times New Roman"/>
+              </w:rPr>
               <w:t>s5</w:t>
             </w:r>
             <w:r>
+              <w:rPr>
+                <w:rFonts w:ascii="Times New Roman" w:hAnsi="Times New Roman" w:cs="Times New Roman"/>
+              </w:rPr>
               <w:t>_oracion_ap$}</w:t>
             </w:r>
           </w:p>
@@ -12362,12 +13022,21 @@
               <w:spacing w:after="0" w:line="240" w:lineRule="auto"/>
             </w:pPr>
             <w:r>
+              <w:rPr>
+                <w:rFonts w:ascii="Times New Roman" w:hAnsi="Times New Roman" w:cs="Times New Roman"/>
+              </w:rPr>
               <w:t>{$</w:t>
             </w:r>
             <w:r>
+              <w:rPr>
+                <w:rFonts w:ascii="Times New Roman" w:hAnsi="Times New Roman" w:cs="Times New Roman"/>
+              </w:rPr>
               <w:t>s5</w:t>
             </w:r>
             <w:r>
+              <w:rPr>
+                <w:rFonts w:ascii="Times New Roman" w:hAnsi="Times New Roman" w:cs="Times New Roman"/>
+              </w:rPr>
               <w:t>_tb_cond$}</w:t>
             </w:r>
           </w:p>
@@ -12527,12 +13196,21 @@
               <w:spacing w:after="0" w:line="240" w:lineRule="auto"/>
             </w:pPr>
             <w:r>
+              <w:rPr>
+                <w:rFonts w:ascii="Times New Roman" w:hAnsi="Times New Roman" w:cs="Times New Roman"/>
+              </w:rPr>
               <w:t>{$</w:t>
             </w:r>
             <w:r>
+              <w:rPr>
+                <w:rFonts w:ascii="Times New Roman" w:hAnsi="Times New Roman" w:cs="Times New Roman"/>
+              </w:rPr>
               <w:t>s5</w:t>
             </w:r>
             <w:r>
+              <w:rPr>
+                <w:rFonts w:ascii="Times New Roman" w:hAnsi="Times New Roman" w:cs="Times New Roman"/>
+              </w:rPr>
               <w:t>_pe_cond$}</w:t>
             </w:r>
           </w:p>
@@ -12692,12 +13370,21 @@
               <w:spacing w:after="0" w:line="240" w:lineRule="auto"/>
             </w:pPr>
             <w:r>
+              <w:rPr>
+                <w:rFonts w:ascii="Times New Roman" w:hAnsi="Times New Roman" w:cs="Times New Roman"/>
+              </w:rPr>
               <w:t>{$</w:t>
             </w:r>
             <w:r>
+              <w:rPr>
+                <w:rFonts w:ascii="Times New Roman" w:hAnsi="Times New Roman" w:cs="Times New Roman"/>
+              </w:rPr>
               <w:t>s5</w:t>
             </w:r>
             <w:r>
+              <w:rPr>
+                <w:rFonts w:ascii="Times New Roman" w:hAnsi="Times New Roman" w:cs="Times New Roman"/>
+              </w:rPr>
               <w:t>_lb_est$}</w:t>
             </w:r>
           </w:p>
@@ -12990,26 +13677,47 @@
               <w:spacing w:after="0" w:line="240" w:lineRule="auto"/>
             </w:pPr>
             <w:r>
+              <w:rPr>
+                <w:rFonts w:ascii="Times New Roman" w:hAnsi="Times New Roman" w:cs="Times New Roman"/>
+              </w:rPr>
               <w:t>{$</w:t>
             </w:r>
             <w:r>
+              <w:rPr>
+                <w:rFonts w:ascii="Times New Roman" w:hAnsi="Times New Roman" w:cs="Times New Roman"/>
+              </w:rPr>
               <w:t>s5</w:t>
             </w:r>
             <w:r>
+              <w:rPr>
+                <w:rFonts w:ascii="Times New Roman" w:hAnsi="Times New Roman" w:cs="Times New Roman"/>
+              </w:rPr>
               <w:t>_smt1_est</w:t>
             </w:r>
             <w:proofErr w:type="gramStart"/>
             <w:r>
-              <w:t>$}/{</w:t>
+              <w:rPr>
+                <w:rFonts w:ascii="Times New Roman" w:hAnsi="Times New Roman" w:cs="Times New Roman"/>
+              </w:rPr>
+              <w:t>$} / {</w:t>
             </w:r>
             <w:proofErr w:type="gramEnd"/>
             <w:r>
+              <w:rPr>
+                <w:rFonts w:ascii="Times New Roman" w:hAnsi="Times New Roman" w:cs="Times New Roman"/>
+              </w:rPr>
               <w:t>$</w:t>
             </w:r>
             <w:r>
+              <w:rPr>
+                <w:rFonts w:ascii="Times New Roman" w:hAnsi="Times New Roman" w:cs="Times New Roman"/>
+              </w:rPr>
               <w:t>s5</w:t>
             </w:r>
             <w:r>
+              <w:rPr>
+                <w:rFonts w:ascii="Times New Roman" w:hAnsi="Times New Roman" w:cs="Times New Roman"/>
+              </w:rPr>
               <w:t>_smt1_ayu$}</w:t>
             </w:r>
           </w:p>
@@ -13195,26 +13903,47 @@
               <w:spacing w:after="0" w:line="240" w:lineRule="auto"/>
             </w:pPr>
             <w:r>
+              <w:rPr>
+                <w:rFonts w:ascii="Times New Roman" w:hAnsi="Times New Roman" w:cs="Times New Roman"/>
+              </w:rPr>
               <w:t>{$</w:t>
             </w:r>
             <w:r>
+              <w:rPr>
+                <w:rFonts w:ascii="Times New Roman" w:hAnsi="Times New Roman" w:cs="Times New Roman"/>
+              </w:rPr>
               <w:t>s5</w:t>
             </w:r>
             <w:r>
+              <w:rPr>
+                <w:rFonts w:ascii="Times New Roman" w:hAnsi="Times New Roman" w:cs="Times New Roman"/>
+              </w:rPr>
               <w:t>_smt2_est</w:t>
             </w:r>
             <w:proofErr w:type="gramStart"/>
             <w:r>
-              <w:t>$}/{</w:t>
+              <w:rPr>
+                <w:rFonts w:ascii="Times New Roman" w:hAnsi="Times New Roman" w:cs="Times New Roman"/>
+              </w:rPr>
+              <w:t>$} / {</w:t>
             </w:r>
             <w:proofErr w:type="gramEnd"/>
             <w:r>
+              <w:rPr>
+                <w:rFonts w:ascii="Times New Roman" w:hAnsi="Times New Roman" w:cs="Times New Roman"/>
+              </w:rPr>
               <w:t>$</w:t>
             </w:r>
             <w:r>
+              <w:rPr>
+                <w:rFonts w:ascii="Times New Roman" w:hAnsi="Times New Roman" w:cs="Times New Roman"/>
+              </w:rPr>
               <w:t>s5</w:t>
             </w:r>
             <w:r>
+              <w:rPr>
+                <w:rFonts w:ascii="Times New Roman" w:hAnsi="Times New Roman" w:cs="Times New Roman"/>
+              </w:rPr>
               <w:t>_smt2_ayu$}</w:t>
             </w:r>
           </w:p>
@@ -13400,26 +14129,47 @@
               <w:spacing w:after="0" w:line="240" w:lineRule="auto"/>
             </w:pPr>
             <w:r>
+              <w:rPr>
+                <w:rFonts w:ascii="Times New Roman" w:hAnsi="Times New Roman" w:cs="Times New Roman"/>
+              </w:rPr>
               <w:t>{$</w:t>
             </w:r>
             <w:r>
+              <w:rPr>
+                <w:rFonts w:ascii="Times New Roman" w:hAnsi="Times New Roman" w:cs="Times New Roman"/>
+              </w:rPr>
               <w:t>s5</w:t>
             </w:r>
             <w:r>
+              <w:rPr>
+                <w:rFonts w:ascii="Times New Roman" w:hAnsi="Times New Roman" w:cs="Times New Roman"/>
+              </w:rPr>
               <w:t>_smt3_est</w:t>
             </w:r>
             <w:proofErr w:type="gramStart"/>
             <w:r>
-              <w:t>$}/{</w:t>
+              <w:rPr>
+                <w:rFonts w:ascii="Times New Roman" w:hAnsi="Times New Roman" w:cs="Times New Roman"/>
+              </w:rPr>
+              <w:t>$} / {</w:t>
             </w:r>
             <w:proofErr w:type="gramEnd"/>
             <w:r>
+              <w:rPr>
+                <w:rFonts w:ascii="Times New Roman" w:hAnsi="Times New Roman" w:cs="Times New Roman"/>
+              </w:rPr>
               <w:t>$</w:t>
             </w:r>
             <w:r>
+              <w:rPr>
+                <w:rFonts w:ascii="Times New Roman" w:hAnsi="Times New Roman" w:cs="Times New Roman"/>
+              </w:rPr>
               <w:t>s5</w:t>
             </w:r>
             <w:r>
+              <w:rPr>
+                <w:rFonts w:ascii="Times New Roman" w:hAnsi="Times New Roman" w:cs="Times New Roman"/>
+              </w:rPr>
               <w:t>_smt3_ayu$}</w:t>
             </w:r>
           </w:p>
@@ -13603,26 +14353,47 @@
               <w:spacing w:after="0" w:line="240" w:lineRule="auto"/>
             </w:pPr>
             <w:r>
+              <w:rPr>
+                <w:rFonts w:ascii="Times New Roman" w:hAnsi="Times New Roman" w:cs="Times New Roman"/>
+              </w:rPr>
               <w:t>{$</w:t>
             </w:r>
             <w:r>
+              <w:rPr>
+                <w:rFonts w:ascii="Times New Roman" w:hAnsi="Times New Roman" w:cs="Times New Roman"/>
+              </w:rPr>
               <w:t>s5</w:t>
             </w:r>
             <w:r>
+              <w:rPr>
+                <w:rFonts w:ascii="Times New Roman" w:hAnsi="Times New Roman" w:cs="Times New Roman"/>
+              </w:rPr>
               <w:t>_smt4_est</w:t>
             </w:r>
             <w:proofErr w:type="gramStart"/>
             <w:r>
-              <w:t>$}/{</w:t>
+              <w:rPr>
+                <w:rFonts w:ascii="Times New Roman" w:hAnsi="Times New Roman" w:cs="Times New Roman"/>
+              </w:rPr>
+              <w:t>$} / {</w:t>
             </w:r>
             <w:proofErr w:type="gramEnd"/>
             <w:r>
+              <w:rPr>
+                <w:rFonts w:ascii="Times New Roman" w:hAnsi="Times New Roman" w:cs="Times New Roman"/>
+              </w:rPr>
               <w:t>$</w:t>
             </w:r>
             <w:r>
+              <w:rPr>
+                <w:rFonts w:ascii="Times New Roman" w:hAnsi="Times New Roman" w:cs="Times New Roman"/>
+              </w:rPr>
               <w:t>s5</w:t>
             </w:r>
             <w:r>
+              <w:rPr>
+                <w:rFonts w:ascii="Times New Roman" w:hAnsi="Times New Roman" w:cs="Times New Roman"/>
+              </w:rPr>
               <w:t>_smt4_ayu$}</w:t>
             </w:r>
           </w:p>
@@ -13954,12 +14725,21 @@
               <w:spacing w:after="0" w:line="240" w:lineRule="auto"/>
             </w:pPr>
             <w:r>
+              <w:rPr>
+                <w:rFonts w:ascii="Times New Roman" w:hAnsi="Times New Roman" w:cs="Times New Roman"/>
+              </w:rPr>
               <w:t>{$</w:t>
             </w:r>
             <w:r>
+              <w:rPr>
+                <w:rFonts w:ascii="Times New Roman" w:hAnsi="Times New Roman" w:cs="Times New Roman"/>
+              </w:rPr>
               <w:t>s5</w:t>
             </w:r>
             <w:r>
+              <w:rPr>
+                <w:rFonts w:ascii="Times New Roman" w:hAnsi="Times New Roman" w:cs="Times New Roman"/>
+              </w:rPr>
               <w:t>_vc1_cond$}</w:t>
             </w:r>
           </w:p>
@@ -14111,12 +14891,21 @@
               <w:spacing w:after="0" w:line="240" w:lineRule="auto"/>
             </w:pPr>
             <w:r>
+              <w:rPr>
+                <w:rFonts w:ascii="Times New Roman" w:hAnsi="Times New Roman" w:cs="Times New Roman"/>
+              </w:rPr>
               <w:t>{$</w:t>
             </w:r>
             <w:r>
+              <w:rPr>
+                <w:rFonts w:ascii="Times New Roman" w:hAnsi="Times New Roman" w:cs="Times New Roman"/>
+              </w:rPr>
               <w:t>s5</w:t>
             </w:r>
             <w:r>
+              <w:rPr>
+                <w:rFonts w:ascii="Times New Roman" w:hAnsi="Times New Roman" w:cs="Times New Roman"/>
+              </w:rPr>
               <w:t>_vc2_cond$}</w:t>
             </w:r>
           </w:p>
@@ -14289,26 +15078,47 @@
               <w:spacing w:after="0" w:line="240" w:lineRule="auto"/>
             </w:pPr>
             <w:r>
+              <w:rPr>
+                <w:rFonts w:ascii="Times New Roman" w:hAnsi="Times New Roman" w:cs="Times New Roman"/>
+              </w:rPr>
               <w:t>{$</w:t>
             </w:r>
             <w:r>
+              <w:rPr>
+                <w:rFonts w:ascii="Times New Roman" w:hAnsi="Times New Roman" w:cs="Times New Roman"/>
+              </w:rPr>
               <w:t>s5</w:t>
             </w:r>
             <w:r>
+              <w:rPr>
+                <w:rFonts w:ascii="Times New Roman" w:hAnsi="Times New Roman" w:cs="Times New Roman"/>
+              </w:rPr>
               <w:t>_ebc_cond</w:t>
             </w:r>
             <w:proofErr w:type="gramStart"/>
             <w:r>
-              <w:t>$}/{</w:t>
+              <w:rPr>
+                <w:rFonts w:ascii="Times New Roman" w:hAnsi="Times New Roman" w:cs="Times New Roman"/>
+              </w:rPr>
+              <w:t>$} / {</w:t>
             </w:r>
             <w:proofErr w:type="gramEnd"/>
             <w:r>
+              <w:rPr>
+                <w:rFonts w:ascii="Times New Roman" w:hAnsi="Times New Roman" w:cs="Times New Roman"/>
+              </w:rPr>
               <w:t>$</w:t>
             </w:r>
             <w:r>
+              <w:rPr>
+                <w:rFonts w:ascii="Times New Roman" w:hAnsi="Times New Roman" w:cs="Times New Roman"/>
+              </w:rPr>
               <w:t>s5</w:t>
             </w:r>
             <w:r>
+              <w:rPr>
+                <w:rFonts w:ascii="Times New Roman" w:hAnsi="Times New Roman" w:cs="Times New Roman"/>
+              </w:rPr>
               <w:t>_ebc_lect$}</w:t>
             </w:r>
           </w:p>
@@ -14570,12 +15380,21 @@
               <w:spacing w:after="0" w:line="240" w:lineRule="auto"/>
             </w:pPr>
             <w:r>
+              <w:rPr>
+                <w:rFonts w:ascii="Times New Roman" w:hAnsi="Times New Roman" w:cs="Times New Roman"/>
+              </w:rPr>
               <w:t>{$</w:t>
             </w:r>
             <w:r>
+              <w:rPr>
+                <w:rFonts w:ascii="Times New Roman" w:hAnsi="Times New Roman" w:cs="Times New Roman"/>
+              </w:rPr>
               <w:t>s5</w:t>
             </w:r>
             <w:r>
+              <w:rPr>
+                <w:rFonts w:ascii="Times New Roman" w:hAnsi="Times New Roman" w:cs="Times New Roman"/>
+              </w:rPr>
               <w:t>_oracion_ci$}</w:t>
             </w:r>
           </w:p>
@@ -14669,6 +15488,7 @@
             <w:pPr>
               <w:spacing w:after="0" w:line="240" w:lineRule="auto"/>
               <w:rPr>
+                <w:rFonts w:ascii="Times New Roman" w:hAnsi="Times New Roman" w:cs="Times New Roman"/>
                 <w:b/>
                 <w:color w:val="808080" w:themeColor="background1" w:themeShade="80"/>
                 <w:sz w:val="16"/>
@@ -14678,6 +15498,7 @@
             </w:pPr>
             <w:r>
               <w:rPr>
+                <w:rFonts w:ascii="Times New Roman" w:hAnsi="Times New Roman" w:cs="Times New Roman"/>
                 <w:b/>
                 <w:lang w:val="es-MX"/>
               </w:rPr>
@@ -14685,6 +15506,7 @@
             </w:r>
             <w:r>
               <w:rPr>
+                <w:rFonts w:ascii="Times New Roman" w:hAnsi="Times New Roman" w:cs="Times New Roman"/>
                 <w:b/>
                 <w:lang w:val="es-MX"/>
               </w:rPr>
@@ -14692,6 +15514,7 @@
             </w:r>
             <w:r>
               <w:rPr>
+                <w:rFonts w:ascii="Times New Roman" w:hAnsi="Times New Roman" w:cs="Times New Roman"/>
                 <w:b/>
                 <w:lang w:val="es-MX"/>
               </w:rPr>
@@ -14745,12 +15568,21 @@
               <w:spacing w:after="0" w:line="240" w:lineRule="auto"/>
             </w:pPr>
             <w:r>
+              <w:rPr>
+                <w:rFonts w:ascii="Times New Roman" w:hAnsi="Times New Roman" w:cs="Times New Roman"/>
+              </w:rPr>
               <w:t>{$</w:t>
             </w:r>
             <w:r>
+              <w:rPr>
+                <w:rFonts w:ascii="Times New Roman" w:hAnsi="Times New Roman" w:cs="Times New Roman"/>
+              </w:rPr>
               <w:t>s6</w:t>
             </w:r>
             <w:r>
+              <w:rPr>
+                <w:rFonts w:ascii="Times New Roman" w:hAnsi="Times New Roman" w:cs="Times New Roman"/>
+              </w:rPr>
               <w:t>_presidente$}</w:t>
             </w:r>
           </w:p>
@@ -14905,12 +15737,21 @@
               <w:spacing w:after="0" w:line="240" w:lineRule="auto"/>
             </w:pPr>
             <w:r>
+              <w:rPr>
+                <w:rFonts w:ascii="Times New Roman" w:hAnsi="Times New Roman" w:cs="Times New Roman"/>
+              </w:rPr>
               <w:t>{$</w:t>
             </w:r>
             <w:r>
+              <w:rPr>
+                <w:rFonts w:ascii="Times New Roman" w:hAnsi="Times New Roman" w:cs="Times New Roman"/>
+              </w:rPr>
               <w:t>s6</w:t>
             </w:r>
             <w:r>
+              <w:rPr>
+                <w:rFonts w:ascii="Times New Roman" w:hAnsi="Times New Roman" w:cs="Times New Roman"/>
+              </w:rPr>
               <w:t>_oracion_ap$}</w:t>
             </w:r>
           </w:p>
@@ -15273,12 +16114,21 @@
               <w:spacing w:after="0" w:line="240" w:lineRule="auto"/>
             </w:pPr>
             <w:r>
+              <w:rPr>
+                <w:rFonts w:ascii="Times New Roman" w:hAnsi="Times New Roman" w:cs="Times New Roman"/>
+              </w:rPr>
               <w:t>{$</w:t>
             </w:r>
             <w:r>
+              <w:rPr>
+                <w:rFonts w:ascii="Times New Roman" w:hAnsi="Times New Roman" w:cs="Times New Roman"/>
+              </w:rPr>
               <w:t>s6</w:t>
             </w:r>
             <w:r>
+              <w:rPr>
+                <w:rFonts w:ascii="Times New Roman" w:hAnsi="Times New Roman" w:cs="Times New Roman"/>
+              </w:rPr>
               <w:t>_tb_cond$}</w:t>
             </w:r>
           </w:p>
@@ -15438,12 +16288,21 @@
               <w:spacing w:after="0" w:line="240" w:lineRule="auto"/>
             </w:pPr>
             <w:r>
+              <w:rPr>
+                <w:rFonts w:ascii="Times New Roman" w:hAnsi="Times New Roman" w:cs="Times New Roman"/>
+              </w:rPr>
               <w:t>{$</w:t>
             </w:r>
             <w:r>
+              <w:rPr>
+                <w:rFonts w:ascii="Times New Roman" w:hAnsi="Times New Roman" w:cs="Times New Roman"/>
+              </w:rPr>
               <w:t>s6</w:t>
             </w:r>
             <w:r>
+              <w:rPr>
+                <w:rFonts w:ascii="Times New Roman" w:hAnsi="Times New Roman" w:cs="Times New Roman"/>
+              </w:rPr>
               <w:t>_pe_cond$}</w:t>
             </w:r>
           </w:p>
@@ -15603,12 +16462,21 @@
               <w:spacing w:after="0" w:line="240" w:lineRule="auto"/>
             </w:pPr>
             <w:r>
+              <w:rPr>
+                <w:rFonts w:ascii="Times New Roman" w:hAnsi="Times New Roman" w:cs="Times New Roman"/>
+              </w:rPr>
               <w:t>{$</w:t>
             </w:r>
             <w:r>
+              <w:rPr>
+                <w:rFonts w:ascii="Times New Roman" w:hAnsi="Times New Roman" w:cs="Times New Roman"/>
+              </w:rPr>
               <w:t>s6</w:t>
             </w:r>
             <w:r>
+              <w:rPr>
+                <w:rFonts w:ascii="Times New Roman" w:hAnsi="Times New Roman" w:cs="Times New Roman"/>
+              </w:rPr>
               <w:t>_lb_est$}</w:t>
             </w:r>
           </w:p>
@@ -15901,26 +16769,47 @@
               <w:spacing w:after="0" w:line="240" w:lineRule="auto"/>
             </w:pPr>
             <w:r>
+              <w:rPr>
+                <w:rFonts w:ascii="Times New Roman" w:hAnsi="Times New Roman" w:cs="Times New Roman"/>
+              </w:rPr>
               <w:t>{$</w:t>
             </w:r>
             <w:r>
+              <w:rPr>
+                <w:rFonts w:ascii="Times New Roman" w:hAnsi="Times New Roman" w:cs="Times New Roman"/>
+              </w:rPr>
               <w:t>s6</w:t>
             </w:r>
             <w:r>
+              <w:rPr>
+                <w:rFonts w:ascii="Times New Roman" w:hAnsi="Times New Roman" w:cs="Times New Roman"/>
+              </w:rPr>
               <w:t>_smt1_est</w:t>
             </w:r>
             <w:proofErr w:type="gramStart"/>
             <w:r>
-              <w:t>$}/{</w:t>
+              <w:rPr>
+                <w:rFonts w:ascii="Times New Roman" w:hAnsi="Times New Roman" w:cs="Times New Roman"/>
+              </w:rPr>
+              <w:t>$} / {</w:t>
             </w:r>
             <w:proofErr w:type="gramEnd"/>
             <w:r>
+              <w:rPr>
+                <w:rFonts w:ascii="Times New Roman" w:hAnsi="Times New Roman" w:cs="Times New Roman"/>
+              </w:rPr>
               <w:t>$</w:t>
             </w:r>
             <w:r>
+              <w:rPr>
+                <w:rFonts w:ascii="Times New Roman" w:hAnsi="Times New Roman" w:cs="Times New Roman"/>
+              </w:rPr>
               <w:t>s6</w:t>
             </w:r>
             <w:r>
+              <w:rPr>
+                <w:rFonts w:ascii="Times New Roman" w:hAnsi="Times New Roman" w:cs="Times New Roman"/>
+              </w:rPr>
               <w:t>_smt1_ayu$}</w:t>
             </w:r>
           </w:p>
@@ -16106,26 +16995,47 @@
               <w:spacing w:after="0" w:line="240" w:lineRule="auto"/>
             </w:pPr>
             <w:r>
+              <w:rPr>
+                <w:rFonts w:ascii="Times New Roman" w:hAnsi="Times New Roman" w:cs="Times New Roman"/>
+              </w:rPr>
               <w:t>{$</w:t>
             </w:r>
             <w:r>
+              <w:rPr>
+                <w:rFonts w:ascii="Times New Roman" w:hAnsi="Times New Roman" w:cs="Times New Roman"/>
+              </w:rPr>
               <w:t>s6</w:t>
             </w:r>
             <w:r>
+              <w:rPr>
+                <w:rFonts w:ascii="Times New Roman" w:hAnsi="Times New Roman" w:cs="Times New Roman"/>
+              </w:rPr>
               <w:t>_smt2_est</w:t>
             </w:r>
             <w:proofErr w:type="gramStart"/>
             <w:r>
-              <w:t>$}/{</w:t>
+              <w:rPr>
+                <w:rFonts w:ascii="Times New Roman" w:hAnsi="Times New Roman" w:cs="Times New Roman"/>
+              </w:rPr>
+              <w:t>$} / {</w:t>
             </w:r>
             <w:proofErr w:type="gramEnd"/>
             <w:r>
+              <w:rPr>
+                <w:rFonts w:ascii="Times New Roman" w:hAnsi="Times New Roman" w:cs="Times New Roman"/>
+              </w:rPr>
               <w:t>$</w:t>
             </w:r>
             <w:r>
+              <w:rPr>
+                <w:rFonts w:ascii="Times New Roman" w:hAnsi="Times New Roman" w:cs="Times New Roman"/>
+              </w:rPr>
               <w:t>s6</w:t>
             </w:r>
             <w:r>
+              <w:rPr>
+                <w:rFonts w:ascii="Times New Roman" w:hAnsi="Times New Roman" w:cs="Times New Roman"/>
+              </w:rPr>
               <w:t>_smt2_ayu$}</w:t>
             </w:r>
           </w:p>
@@ -16311,26 +17221,47 @@
               <w:spacing w:after="0" w:line="240" w:lineRule="auto"/>
             </w:pPr>
             <w:r>
+              <w:rPr>
+                <w:rFonts w:ascii="Times New Roman" w:hAnsi="Times New Roman" w:cs="Times New Roman"/>
+              </w:rPr>
               <w:t>{$</w:t>
             </w:r>
             <w:r>
+              <w:rPr>
+                <w:rFonts w:ascii="Times New Roman" w:hAnsi="Times New Roman" w:cs="Times New Roman"/>
+              </w:rPr>
               <w:t>s6</w:t>
             </w:r>
             <w:r>
+              <w:rPr>
+                <w:rFonts w:ascii="Times New Roman" w:hAnsi="Times New Roman" w:cs="Times New Roman"/>
+              </w:rPr>
               <w:t>_smt3_est</w:t>
             </w:r>
             <w:proofErr w:type="gramStart"/>
             <w:r>
-              <w:t>$}/{</w:t>
+              <w:rPr>
+                <w:rFonts w:ascii="Times New Roman" w:hAnsi="Times New Roman" w:cs="Times New Roman"/>
+              </w:rPr>
+              <w:t>$} / {</w:t>
             </w:r>
             <w:proofErr w:type="gramEnd"/>
             <w:r>
+              <w:rPr>
+                <w:rFonts w:ascii="Times New Roman" w:hAnsi="Times New Roman" w:cs="Times New Roman"/>
+              </w:rPr>
               <w:t>$</w:t>
             </w:r>
             <w:r>
+              <w:rPr>
+                <w:rFonts w:ascii="Times New Roman" w:hAnsi="Times New Roman" w:cs="Times New Roman"/>
+              </w:rPr>
               <w:t>s6</w:t>
             </w:r>
             <w:r>
+              <w:rPr>
+                <w:rFonts w:ascii="Times New Roman" w:hAnsi="Times New Roman" w:cs="Times New Roman"/>
+              </w:rPr>
               <w:t>_smt3_ayu$}</w:t>
             </w:r>
           </w:p>
@@ -16514,26 +17445,47 @@
               <w:spacing w:after="0" w:line="240" w:lineRule="auto"/>
             </w:pPr>
             <w:r>
+              <w:rPr>
+                <w:rFonts w:ascii="Times New Roman" w:hAnsi="Times New Roman" w:cs="Times New Roman"/>
+              </w:rPr>
               <w:t>{$</w:t>
             </w:r>
             <w:r>
+              <w:rPr>
+                <w:rFonts w:ascii="Times New Roman" w:hAnsi="Times New Roman" w:cs="Times New Roman"/>
+              </w:rPr>
               <w:t>s6</w:t>
             </w:r>
             <w:r>
+              <w:rPr>
+                <w:rFonts w:ascii="Times New Roman" w:hAnsi="Times New Roman" w:cs="Times New Roman"/>
+              </w:rPr>
               <w:t>_smt4_est</w:t>
             </w:r>
             <w:proofErr w:type="gramStart"/>
             <w:r>
-              <w:t>$}/{</w:t>
+              <w:rPr>
+                <w:rFonts w:ascii="Times New Roman" w:hAnsi="Times New Roman" w:cs="Times New Roman"/>
+              </w:rPr>
+              <w:t>$} / {</w:t>
             </w:r>
             <w:proofErr w:type="gramEnd"/>
             <w:r>
+              <w:rPr>
+                <w:rFonts w:ascii="Times New Roman" w:hAnsi="Times New Roman" w:cs="Times New Roman"/>
+              </w:rPr>
               <w:t>$</w:t>
             </w:r>
             <w:r>
+              <w:rPr>
+                <w:rFonts w:ascii="Times New Roman" w:hAnsi="Times New Roman" w:cs="Times New Roman"/>
+              </w:rPr>
               <w:t>s6</w:t>
             </w:r>
             <w:r>
+              <w:rPr>
+                <w:rFonts w:ascii="Times New Roman" w:hAnsi="Times New Roman" w:cs="Times New Roman"/>
+              </w:rPr>
               <w:t>_smt4_ayu$}</w:t>
             </w:r>
           </w:p>
@@ -16865,12 +17817,21 @@
               <w:spacing w:after="0" w:line="240" w:lineRule="auto"/>
             </w:pPr>
             <w:r>
+              <w:rPr>
+                <w:rFonts w:ascii="Times New Roman" w:hAnsi="Times New Roman" w:cs="Times New Roman"/>
+              </w:rPr>
               <w:t>{$</w:t>
             </w:r>
             <w:r>
+              <w:rPr>
+                <w:rFonts w:ascii="Times New Roman" w:hAnsi="Times New Roman" w:cs="Times New Roman"/>
+              </w:rPr>
               <w:t>s6</w:t>
             </w:r>
             <w:r>
+              <w:rPr>
+                <w:rFonts w:ascii="Times New Roman" w:hAnsi="Times New Roman" w:cs="Times New Roman"/>
+              </w:rPr>
               <w:t>_vc1_cond$}</w:t>
             </w:r>
           </w:p>
@@ -17022,12 +17983,21 @@
               <w:spacing w:after="0" w:line="240" w:lineRule="auto"/>
             </w:pPr>
             <w:r>
+              <w:rPr>
+                <w:rFonts w:ascii="Times New Roman" w:hAnsi="Times New Roman" w:cs="Times New Roman"/>
+              </w:rPr>
               <w:t>{$</w:t>
             </w:r>
             <w:r>
+              <w:rPr>
+                <w:rFonts w:ascii="Times New Roman" w:hAnsi="Times New Roman" w:cs="Times New Roman"/>
+              </w:rPr>
               <w:t>s6</w:t>
             </w:r>
             <w:r>
+              <w:rPr>
+                <w:rFonts w:ascii="Times New Roman" w:hAnsi="Times New Roman" w:cs="Times New Roman"/>
+              </w:rPr>
               <w:t>_vc2_cond$}</w:t>
             </w:r>
           </w:p>
@@ -17200,26 +18170,47 @@
               <w:spacing w:after="0" w:line="240" w:lineRule="auto"/>
             </w:pPr>
             <w:r>
+              <w:rPr>
+                <w:rFonts w:ascii="Times New Roman" w:hAnsi="Times New Roman" w:cs="Times New Roman"/>
+              </w:rPr>
               <w:t>{$</w:t>
             </w:r>
             <w:r>
+              <w:rPr>
+                <w:rFonts w:ascii="Times New Roman" w:hAnsi="Times New Roman" w:cs="Times New Roman"/>
+              </w:rPr>
               <w:t>s6</w:t>
             </w:r>
             <w:r>
+              <w:rPr>
+                <w:rFonts w:ascii="Times New Roman" w:hAnsi="Times New Roman" w:cs="Times New Roman"/>
+              </w:rPr>
               <w:t>_ebc_cond</w:t>
             </w:r>
             <w:proofErr w:type="gramStart"/>
             <w:r>
-              <w:t>$}/{</w:t>
+              <w:rPr>
+                <w:rFonts w:ascii="Times New Roman" w:hAnsi="Times New Roman" w:cs="Times New Roman"/>
+              </w:rPr>
+              <w:t>$} / {</w:t>
             </w:r>
             <w:proofErr w:type="gramEnd"/>
             <w:r>
+              <w:rPr>
+                <w:rFonts w:ascii="Times New Roman" w:hAnsi="Times New Roman" w:cs="Times New Roman"/>
+              </w:rPr>
               <w:t>$</w:t>
             </w:r>
             <w:r>
+              <w:rPr>
+                <w:rFonts w:ascii="Times New Roman" w:hAnsi="Times New Roman" w:cs="Times New Roman"/>
+              </w:rPr>
               <w:t>s6</w:t>
             </w:r>
             <w:r>
+              <w:rPr>
+                <w:rFonts w:ascii="Times New Roman" w:hAnsi="Times New Roman" w:cs="Times New Roman"/>
+              </w:rPr>
               <w:t>_ebc_lect$}</w:t>
             </w:r>
           </w:p>
@@ -17481,12 +18472,21 @@
               <w:spacing w:after="0" w:line="240" w:lineRule="auto"/>
             </w:pPr>
             <w:r>
+              <w:rPr>
+                <w:rFonts w:ascii="Times New Roman" w:hAnsi="Times New Roman" w:cs="Times New Roman"/>
+              </w:rPr>
               <w:t>{$</w:t>
             </w:r>
             <w:r>
+              <w:rPr>
+                <w:rFonts w:ascii="Times New Roman" w:hAnsi="Times New Roman" w:cs="Times New Roman"/>
+              </w:rPr>
               <w:t>s6</w:t>
             </w:r>
             <w:r>
+              <w:rPr>
+                <w:rFonts w:ascii="Times New Roman" w:hAnsi="Times New Roman" w:cs="Times New Roman"/>
+              </w:rPr>
               <w:t>_oracion_ci$}</w:t>
             </w:r>
           </w:p>
@@ -17550,11 +18550,15 @@
               <w:spacing w:after="60" w:line="240" w:lineRule="auto"/>
               <w:rPr>
                 <w:b/>
-              </w:rPr>
-            </w:pPr>
-            <w:r>
-              <w:rPr>
-                <w:b/>
+                <w:sz w:val="28"/>
+                <w:szCs w:val="28"/>
+              </w:rPr>
+            </w:pPr>
+            <w:r>
+              <w:rPr>
+                <w:b/>
+                <w:sz w:val="28"/>
+                <w:szCs w:val="28"/>
               </w:rPr>
               <w:lastRenderedPageBreak/>
               <w:t>{$</w:t>
@@ -17564,6 +18568,8 @@
               <w:rPr>
                 <w:b/>
                 <w:bCs/>
+                <w:sz w:val="28"/>
+                <w:szCs w:val="28"/>
               </w:rPr>
               <w:t>congregacion</w:t>
             </w:r>
@@ -17571,6 +18577,8 @@
             <w:r>
               <w:rPr>
                 <w:b/>
+                <w:sz w:val="28"/>
+                <w:szCs w:val="28"/>
               </w:rPr>
               <w:t>$}</w:t>
             </w:r>
@@ -17656,6 +18664,7 @@
             <w:pPr>
               <w:spacing w:after="0" w:line="240" w:lineRule="auto"/>
               <w:rPr>
+                <w:rFonts w:ascii="Times New Roman" w:hAnsi="Times New Roman" w:cs="Times New Roman"/>
                 <w:b/>
                 <w:color w:val="808080" w:themeColor="background1" w:themeShade="80"/>
                 <w:sz w:val="16"/>
@@ -17665,6 +18674,7 @@
             </w:pPr>
             <w:r>
               <w:rPr>
+                <w:rFonts w:ascii="Times New Roman" w:hAnsi="Times New Roman" w:cs="Times New Roman"/>
                 <w:b/>
                 <w:lang w:val="es-MX"/>
               </w:rPr>
@@ -17672,6 +18682,7 @@
             </w:r>
             <w:r>
               <w:rPr>
+                <w:rFonts w:ascii="Times New Roman" w:hAnsi="Times New Roman" w:cs="Times New Roman"/>
                 <w:b/>
                 <w:lang w:val="es-MX"/>
               </w:rPr>
@@ -17679,6 +18690,7 @@
             </w:r>
             <w:r>
               <w:rPr>
+                <w:rFonts w:ascii="Times New Roman" w:hAnsi="Times New Roman" w:cs="Times New Roman"/>
                 <w:b/>
                 <w:lang w:val="es-MX"/>
               </w:rPr>
@@ -17732,12 +18744,21 @@
               <w:spacing w:after="0" w:line="240" w:lineRule="auto"/>
             </w:pPr>
             <w:r>
+              <w:rPr>
+                <w:rFonts w:ascii="Times New Roman" w:hAnsi="Times New Roman" w:cs="Times New Roman"/>
+              </w:rPr>
               <w:t>{$</w:t>
             </w:r>
             <w:r>
+              <w:rPr>
+                <w:rFonts w:ascii="Times New Roman" w:hAnsi="Times New Roman" w:cs="Times New Roman"/>
+              </w:rPr>
               <w:t>s7</w:t>
             </w:r>
             <w:r>
+              <w:rPr>
+                <w:rFonts w:ascii="Times New Roman" w:hAnsi="Times New Roman" w:cs="Times New Roman"/>
+              </w:rPr>
               <w:t>_presidente$}</w:t>
             </w:r>
           </w:p>
@@ -17892,12 +18913,21 @@
               <w:spacing w:after="0" w:line="240" w:lineRule="auto"/>
             </w:pPr>
             <w:r>
+              <w:rPr>
+                <w:rFonts w:ascii="Times New Roman" w:hAnsi="Times New Roman" w:cs="Times New Roman"/>
+              </w:rPr>
               <w:t>{$</w:t>
             </w:r>
             <w:r>
+              <w:rPr>
+                <w:rFonts w:ascii="Times New Roman" w:hAnsi="Times New Roman" w:cs="Times New Roman"/>
+              </w:rPr>
               <w:t>s7</w:t>
             </w:r>
             <w:r>
+              <w:rPr>
+                <w:rFonts w:ascii="Times New Roman" w:hAnsi="Times New Roman" w:cs="Times New Roman"/>
+              </w:rPr>
               <w:t>_oracion_ap$}</w:t>
             </w:r>
           </w:p>
@@ -18260,12 +19290,21 @@
               <w:spacing w:after="0" w:line="240" w:lineRule="auto"/>
             </w:pPr>
             <w:r>
+              <w:rPr>
+                <w:rFonts w:ascii="Times New Roman" w:hAnsi="Times New Roman" w:cs="Times New Roman"/>
+              </w:rPr>
               <w:t>{$</w:t>
             </w:r>
             <w:r>
+              <w:rPr>
+                <w:rFonts w:ascii="Times New Roman" w:hAnsi="Times New Roman" w:cs="Times New Roman"/>
+              </w:rPr>
               <w:t>s7</w:t>
             </w:r>
             <w:r>
+              <w:rPr>
+                <w:rFonts w:ascii="Times New Roman" w:hAnsi="Times New Roman" w:cs="Times New Roman"/>
+              </w:rPr>
               <w:t>_tb_cond$}</w:t>
             </w:r>
           </w:p>
@@ -18425,12 +19464,21 @@
               <w:spacing w:after="0" w:line="240" w:lineRule="auto"/>
             </w:pPr>
             <w:r>
+              <w:rPr>
+                <w:rFonts w:ascii="Times New Roman" w:hAnsi="Times New Roman" w:cs="Times New Roman"/>
+              </w:rPr>
               <w:t>{$</w:t>
             </w:r>
             <w:r>
+              <w:rPr>
+                <w:rFonts w:ascii="Times New Roman" w:hAnsi="Times New Roman" w:cs="Times New Roman"/>
+              </w:rPr>
               <w:t>s7</w:t>
             </w:r>
             <w:r>
+              <w:rPr>
+                <w:rFonts w:ascii="Times New Roman" w:hAnsi="Times New Roman" w:cs="Times New Roman"/>
+              </w:rPr>
               <w:t>_pe_cond$}</w:t>
             </w:r>
           </w:p>
@@ -18590,12 +19638,21 @@
               <w:spacing w:after="0" w:line="240" w:lineRule="auto"/>
             </w:pPr>
             <w:r>
+              <w:rPr>
+                <w:rFonts w:ascii="Times New Roman" w:hAnsi="Times New Roman" w:cs="Times New Roman"/>
+              </w:rPr>
               <w:t>{$</w:t>
             </w:r>
             <w:r>
+              <w:rPr>
+                <w:rFonts w:ascii="Times New Roman" w:hAnsi="Times New Roman" w:cs="Times New Roman"/>
+              </w:rPr>
               <w:t>s7</w:t>
             </w:r>
             <w:r>
+              <w:rPr>
+                <w:rFonts w:ascii="Times New Roman" w:hAnsi="Times New Roman" w:cs="Times New Roman"/>
+              </w:rPr>
               <w:t>_lb_est$}</w:t>
             </w:r>
           </w:p>
@@ -18888,26 +19945,47 @@
               <w:spacing w:after="0" w:line="240" w:lineRule="auto"/>
             </w:pPr>
             <w:r>
+              <w:rPr>
+                <w:rFonts w:ascii="Times New Roman" w:hAnsi="Times New Roman" w:cs="Times New Roman"/>
+              </w:rPr>
               <w:t>{$</w:t>
             </w:r>
             <w:r>
+              <w:rPr>
+                <w:rFonts w:ascii="Times New Roman" w:hAnsi="Times New Roman" w:cs="Times New Roman"/>
+              </w:rPr>
               <w:t>s7</w:t>
             </w:r>
             <w:r>
+              <w:rPr>
+                <w:rFonts w:ascii="Times New Roman" w:hAnsi="Times New Roman" w:cs="Times New Roman"/>
+              </w:rPr>
               <w:t>_smt1_est</w:t>
             </w:r>
             <w:proofErr w:type="gramStart"/>
             <w:r>
-              <w:t>$}/{</w:t>
+              <w:rPr>
+                <w:rFonts w:ascii="Times New Roman" w:hAnsi="Times New Roman" w:cs="Times New Roman"/>
+              </w:rPr>
+              <w:t>$} / {</w:t>
             </w:r>
             <w:proofErr w:type="gramEnd"/>
             <w:r>
+              <w:rPr>
+                <w:rFonts w:ascii="Times New Roman" w:hAnsi="Times New Roman" w:cs="Times New Roman"/>
+              </w:rPr>
               <w:t>$</w:t>
             </w:r>
             <w:r>
+              <w:rPr>
+                <w:rFonts w:ascii="Times New Roman" w:hAnsi="Times New Roman" w:cs="Times New Roman"/>
+              </w:rPr>
               <w:t>s7</w:t>
             </w:r>
             <w:r>
+              <w:rPr>
+                <w:rFonts w:ascii="Times New Roman" w:hAnsi="Times New Roman" w:cs="Times New Roman"/>
+              </w:rPr>
               <w:t>_smt1_ayu$}</w:t>
             </w:r>
           </w:p>
@@ -19093,26 +20171,47 @@
               <w:spacing w:after="0" w:line="240" w:lineRule="auto"/>
             </w:pPr>
             <w:r>
+              <w:rPr>
+                <w:rFonts w:ascii="Times New Roman" w:hAnsi="Times New Roman" w:cs="Times New Roman"/>
+              </w:rPr>
               <w:t>{$</w:t>
             </w:r>
             <w:r>
+              <w:rPr>
+                <w:rFonts w:ascii="Times New Roman" w:hAnsi="Times New Roman" w:cs="Times New Roman"/>
+              </w:rPr>
               <w:t>s7</w:t>
             </w:r>
             <w:r>
+              <w:rPr>
+                <w:rFonts w:ascii="Times New Roman" w:hAnsi="Times New Roman" w:cs="Times New Roman"/>
+              </w:rPr>
               <w:t>_smt2_est</w:t>
             </w:r>
             <w:proofErr w:type="gramStart"/>
             <w:r>
-              <w:t>$}/{</w:t>
+              <w:rPr>
+                <w:rFonts w:ascii="Times New Roman" w:hAnsi="Times New Roman" w:cs="Times New Roman"/>
+              </w:rPr>
+              <w:t>$} / {</w:t>
             </w:r>
             <w:proofErr w:type="gramEnd"/>
             <w:r>
+              <w:rPr>
+                <w:rFonts w:ascii="Times New Roman" w:hAnsi="Times New Roman" w:cs="Times New Roman"/>
+              </w:rPr>
               <w:t>$</w:t>
             </w:r>
             <w:r>
+              <w:rPr>
+                <w:rFonts w:ascii="Times New Roman" w:hAnsi="Times New Roman" w:cs="Times New Roman"/>
+              </w:rPr>
               <w:t>s7</w:t>
             </w:r>
             <w:r>
+              <w:rPr>
+                <w:rFonts w:ascii="Times New Roman" w:hAnsi="Times New Roman" w:cs="Times New Roman"/>
+              </w:rPr>
               <w:t>_smt2_ayu$}</w:t>
             </w:r>
           </w:p>
@@ -19298,26 +20397,47 @@
               <w:spacing w:after="0" w:line="240" w:lineRule="auto"/>
             </w:pPr>
             <w:r>
+              <w:rPr>
+                <w:rFonts w:ascii="Times New Roman" w:hAnsi="Times New Roman" w:cs="Times New Roman"/>
+              </w:rPr>
               <w:t>{$</w:t>
             </w:r>
             <w:r>
+              <w:rPr>
+                <w:rFonts w:ascii="Times New Roman" w:hAnsi="Times New Roman" w:cs="Times New Roman"/>
+              </w:rPr>
               <w:t>s7</w:t>
             </w:r>
             <w:r>
+              <w:rPr>
+                <w:rFonts w:ascii="Times New Roman" w:hAnsi="Times New Roman" w:cs="Times New Roman"/>
+              </w:rPr>
               <w:t>_smt3_est</w:t>
             </w:r>
             <w:proofErr w:type="gramStart"/>
             <w:r>
-              <w:t>$}/{</w:t>
+              <w:rPr>
+                <w:rFonts w:ascii="Times New Roman" w:hAnsi="Times New Roman" w:cs="Times New Roman"/>
+              </w:rPr>
+              <w:t>$} / {</w:t>
             </w:r>
             <w:proofErr w:type="gramEnd"/>
             <w:r>
+              <w:rPr>
+                <w:rFonts w:ascii="Times New Roman" w:hAnsi="Times New Roman" w:cs="Times New Roman"/>
+              </w:rPr>
               <w:t>$</w:t>
             </w:r>
             <w:r>
+              <w:rPr>
+                <w:rFonts w:ascii="Times New Roman" w:hAnsi="Times New Roman" w:cs="Times New Roman"/>
+              </w:rPr>
               <w:t>s7</w:t>
             </w:r>
             <w:r>
+              <w:rPr>
+                <w:rFonts w:ascii="Times New Roman" w:hAnsi="Times New Roman" w:cs="Times New Roman"/>
+              </w:rPr>
               <w:t>_smt3_ayu$}</w:t>
             </w:r>
           </w:p>
@@ -19501,26 +20621,47 @@
               <w:spacing w:after="0" w:line="240" w:lineRule="auto"/>
             </w:pPr>
             <w:r>
+              <w:rPr>
+                <w:rFonts w:ascii="Times New Roman" w:hAnsi="Times New Roman" w:cs="Times New Roman"/>
+              </w:rPr>
               <w:t>{$</w:t>
             </w:r>
             <w:r>
+              <w:rPr>
+                <w:rFonts w:ascii="Times New Roman" w:hAnsi="Times New Roman" w:cs="Times New Roman"/>
+              </w:rPr>
               <w:t>s7</w:t>
             </w:r>
             <w:r>
+              <w:rPr>
+                <w:rFonts w:ascii="Times New Roman" w:hAnsi="Times New Roman" w:cs="Times New Roman"/>
+              </w:rPr>
               <w:t>_smt4_est</w:t>
             </w:r>
             <w:proofErr w:type="gramStart"/>
             <w:r>
-              <w:t>$}/{</w:t>
+              <w:rPr>
+                <w:rFonts w:ascii="Times New Roman" w:hAnsi="Times New Roman" w:cs="Times New Roman"/>
+              </w:rPr>
+              <w:t>$} / {</w:t>
             </w:r>
             <w:proofErr w:type="gramEnd"/>
             <w:r>
+              <w:rPr>
+                <w:rFonts w:ascii="Times New Roman" w:hAnsi="Times New Roman" w:cs="Times New Roman"/>
+              </w:rPr>
               <w:t>$</w:t>
             </w:r>
             <w:r>
+              <w:rPr>
+                <w:rFonts w:ascii="Times New Roman" w:hAnsi="Times New Roman" w:cs="Times New Roman"/>
+              </w:rPr>
               <w:t>s7</w:t>
             </w:r>
             <w:r>
+              <w:rPr>
+                <w:rFonts w:ascii="Times New Roman" w:hAnsi="Times New Roman" w:cs="Times New Roman"/>
+              </w:rPr>
               <w:t>_smt4_ayu$}</w:t>
             </w:r>
           </w:p>
@@ -19852,12 +20993,21 @@
               <w:spacing w:after="0" w:line="240" w:lineRule="auto"/>
             </w:pPr>
             <w:r>
+              <w:rPr>
+                <w:rFonts w:ascii="Times New Roman" w:hAnsi="Times New Roman" w:cs="Times New Roman"/>
+              </w:rPr>
               <w:t>{$</w:t>
             </w:r>
             <w:r>
+              <w:rPr>
+                <w:rFonts w:ascii="Times New Roman" w:hAnsi="Times New Roman" w:cs="Times New Roman"/>
+              </w:rPr>
               <w:t>s7</w:t>
             </w:r>
             <w:r>
+              <w:rPr>
+                <w:rFonts w:ascii="Times New Roman" w:hAnsi="Times New Roman" w:cs="Times New Roman"/>
+              </w:rPr>
               <w:t>_vc1_cond$}</w:t>
             </w:r>
           </w:p>
@@ -20009,12 +21159,21 @@
               <w:spacing w:after="0" w:line="240" w:lineRule="auto"/>
             </w:pPr>
             <w:r>
+              <w:rPr>
+                <w:rFonts w:ascii="Times New Roman" w:hAnsi="Times New Roman" w:cs="Times New Roman"/>
+              </w:rPr>
               <w:t>{$</w:t>
             </w:r>
             <w:r>
+              <w:rPr>
+                <w:rFonts w:ascii="Times New Roman" w:hAnsi="Times New Roman" w:cs="Times New Roman"/>
+              </w:rPr>
               <w:t>s7</w:t>
             </w:r>
             <w:r>
+              <w:rPr>
+                <w:rFonts w:ascii="Times New Roman" w:hAnsi="Times New Roman" w:cs="Times New Roman"/>
+              </w:rPr>
               <w:t>_vc2_cond$}</w:t>
             </w:r>
           </w:p>
@@ -20187,26 +21346,47 @@
               <w:spacing w:after="0" w:line="240" w:lineRule="auto"/>
             </w:pPr>
             <w:r>
+              <w:rPr>
+                <w:rFonts w:ascii="Times New Roman" w:hAnsi="Times New Roman" w:cs="Times New Roman"/>
+              </w:rPr>
               <w:t>{$</w:t>
             </w:r>
             <w:r>
+              <w:rPr>
+                <w:rFonts w:ascii="Times New Roman" w:hAnsi="Times New Roman" w:cs="Times New Roman"/>
+              </w:rPr>
               <w:t>s7</w:t>
             </w:r>
             <w:r>
+              <w:rPr>
+                <w:rFonts w:ascii="Times New Roman" w:hAnsi="Times New Roman" w:cs="Times New Roman"/>
+              </w:rPr>
               <w:t>_ebc_cond</w:t>
             </w:r>
             <w:proofErr w:type="gramStart"/>
             <w:r>
-              <w:t>$}/{</w:t>
+              <w:rPr>
+                <w:rFonts w:ascii="Times New Roman" w:hAnsi="Times New Roman" w:cs="Times New Roman"/>
+              </w:rPr>
+              <w:t>$} / {</w:t>
             </w:r>
             <w:proofErr w:type="gramEnd"/>
             <w:r>
+              <w:rPr>
+                <w:rFonts w:ascii="Times New Roman" w:hAnsi="Times New Roman" w:cs="Times New Roman"/>
+              </w:rPr>
               <w:t>$</w:t>
             </w:r>
             <w:r>
+              <w:rPr>
+                <w:rFonts w:ascii="Times New Roman" w:hAnsi="Times New Roman" w:cs="Times New Roman"/>
+              </w:rPr>
               <w:t>s7</w:t>
             </w:r>
             <w:r>
+              <w:rPr>
+                <w:rFonts w:ascii="Times New Roman" w:hAnsi="Times New Roman" w:cs="Times New Roman"/>
+              </w:rPr>
               <w:t>_ebc_lect$}</w:t>
             </w:r>
           </w:p>
@@ -20468,12 +21648,21 @@
               <w:spacing w:after="0" w:line="240" w:lineRule="auto"/>
             </w:pPr>
             <w:r>
+              <w:rPr>
+                <w:rFonts w:ascii="Times New Roman" w:hAnsi="Times New Roman" w:cs="Times New Roman"/>
+              </w:rPr>
               <w:t>{$</w:t>
             </w:r>
             <w:r>
+              <w:rPr>
+                <w:rFonts w:ascii="Times New Roman" w:hAnsi="Times New Roman" w:cs="Times New Roman"/>
+              </w:rPr>
               <w:t>s7</w:t>
             </w:r>
             <w:r>
+              <w:rPr>
+                <w:rFonts w:ascii="Times New Roman" w:hAnsi="Times New Roman" w:cs="Times New Roman"/>
+              </w:rPr>
               <w:t>_oracion_ci$}</w:t>
             </w:r>
           </w:p>
@@ -20567,6 +21756,7 @@
             <w:pPr>
               <w:spacing w:after="0" w:line="240" w:lineRule="auto"/>
               <w:rPr>
+                <w:rFonts w:ascii="Times New Roman" w:hAnsi="Times New Roman" w:cs="Times New Roman"/>
                 <w:b/>
                 <w:color w:val="808080" w:themeColor="background1" w:themeShade="80"/>
                 <w:sz w:val="16"/>
@@ -20576,6 +21766,7 @@
             </w:pPr>
             <w:r>
               <w:rPr>
+                <w:rFonts w:ascii="Times New Roman" w:hAnsi="Times New Roman" w:cs="Times New Roman"/>
                 <w:b/>
                 <w:lang w:val="es-MX"/>
               </w:rPr>
@@ -20583,6 +21774,7 @@
             </w:r>
             <w:r>
               <w:rPr>
+                <w:rFonts w:ascii="Times New Roman" w:hAnsi="Times New Roman" w:cs="Times New Roman"/>
                 <w:b/>
                 <w:lang w:val="es-MX"/>
               </w:rPr>
@@ -20590,6 +21782,7 @@
             </w:r>
             <w:r>
               <w:rPr>
+                <w:rFonts w:ascii="Times New Roman" w:hAnsi="Times New Roman" w:cs="Times New Roman"/>
                 <w:b/>
                 <w:lang w:val="es-MX"/>
               </w:rPr>
@@ -20643,12 +21836,21 @@
               <w:spacing w:after="0" w:line="240" w:lineRule="auto"/>
             </w:pPr>
             <w:r>
+              <w:rPr>
+                <w:rFonts w:ascii="Times New Roman" w:hAnsi="Times New Roman" w:cs="Times New Roman"/>
+              </w:rPr>
               <w:t>{$</w:t>
             </w:r>
             <w:r>
+              <w:rPr>
+                <w:rFonts w:ascii="Times New Roman" w:hAnsi="Times New Roman" w:cs="Times New Roman"/>
+              </w:rPr>
               <w:t>s8</w:t>
             </w:r>
             <w:r>
+              <w:rPr>
+                <w:rFonts w:ascii="Times New Roman" w:hAnsi="Times New Roman" w:cs="Times New Roman"/>
+              </w:rPr>
               <w:t>_presidente$}</w:t>
             </w:r>
           </w:p>
@@ -20803,12 +22005,21 @@
               <w:spacing w:after="0" w:line="240" w:lineRule="auto"/>
             </w:pPr>
             <w:r>
+              <w:rPr>
+                <w:rFonts w:ascii="Times New Roman" w:hAnsi="Times New Roman" w:cs="Times New Roman"/>
+              </w:rPr>
               <w:t>{$</w:t>
             </w:r>
             <w:r>
+              <w:rPr>
+                <w:rFonts w:ascii="Times New Roman" w:hAnsi="Times New Roman" w:cs="Times New Roman"/>
+              </w:rPr>
               <w:t>s8</w:t>
             </w:r>
             <w:r>
+              <w:rPr>
+                <w:rFonts w:ascii="Times New Roman" w:hAnsi="Times New Roman" w:cs="Times New Roman"/>
+              </w:rPr>
               <w:t>_oracion_ap$}</w:t>
             </w:r>
           </w:p>
@@ -21171,12 +22382,21 @@
               <w:spacing w:after="0" w:line="240" w:lineRule="auto"/>
             </w:pPr>
             <w:r>
+              <w:rPr>
+                <w:rFonts w:ascii="Times New Roman" w:hAnsi="Times New Roman" w:cs="Times New Roman"/>
+              </w:rPr>
               <w:t>{$</w:t>
             </w:r>
             <w:r>
+              <w:rPr>
+                <w:rFonts w:ascii="Times New Roman" w:hAnsi="Times New Roman" w:cs="Times New Roman"/>
+              </w:rPr>
               <w:t>s8</w:t>
             </w:r>
             <w:r>
+              <w:rPr>
+                <w:rFonts w:ascii="Times New Roman" w:hAnsi="Times New Roman" w:cs="Times New Roman"/>
+              </w:rPr>
               <w:t>_tb_cond$}</w:t>
             </w:r>
           </w:p>
@@ -21336,12 +22556,21 @@
               <w:spacing w:after="0" w:line="240" w:lineRule="auto"/>
             </w:pPr>
             <w:r>
+              <w:rPr>
+                <w:rFonts w:ascii="Times New Roman" w:hAnsi="Times New Roman" w:cs="Times New Roman"/>
+              </w:rPr>
               <w:t>{$</w:t>
             </w:r>
             <w:r>
+              <w:rPr>
+                <w:rFonts w:ascii="Times New Roman" w:hAnsi="Times New Roman" w:cs="Times New Roman"/>
+              </w:rPr>
               <w:t>s8</w:t>
             </w:r>
             <w:r>
+              <w:rPr>
+                <w:rFonts w:ascii="Times New Roman" w:hAnsi="Times New Roman" w:cs="Times New Roman"/>
+              </w:rPr>
               <w:t>_pe_cond$}</w:t>
             </w:r>
           </w:p>
@@ -21501,12 +22730,21 @@
               <w:spacing w:after="0" w:line="240" w:lineRule="auto"/>
             </w:pPr>
             <w:r>
+              <w:rPr>
+                <w:rFonts w:ascii="Times New Roman" w:hAnsi="Times New Roman" w:cs="Times New Roman"/>
+              </w:rPr>
               <w:t>{$</w:t>
             </w:r>
             <w:r>
+              <w:rPr>
+                <w:rFonts w:ascii="Times New Roman" w:hAnsi="Times New Roman" w:cs="Times New Roman"/>
+              </w:rPr>
               <w:t>s8</w:t>
             </w:r>
             <w:r>
+              <w:rPr>
+                <w:rFonts w:ascii="Times New Roman" w:hAnsi="Times New Roman" w:cs="Times New Roman"/>
+              </w:rPr>
               <w:t>_lb_est$}</w:t>
             </w:r>
           </w:p>
@@ -21799,26 +23037,47 @@
               <w:spacing w:after="0" w:line="240" w:lineRule="auto"/>
             </w:pPr>
             <w:r>
+              <w:rPr>
+                <w:rFonts w:ascii="Times New Roman" w:hAnsi="Times New Roman" w:cs="Times New Roman"/>
+              </w:rPr>
               <w:t>{$</w:t>
             </w:r>
             <w:r>
+              <w:rPr>
+                <w:rFonts w:ascii="Times New Roman" w:hAnsi="Times New Roman" w:cs="Times New Roman"/>
+              </w:rPr>
               <w:t>s8</w:t>
             </w:r>
             <w:r>
+              <w:rPr>
+                <w:rFonts w:ascii="Times New Roman" w:hAnsi="Times New Roman" w:cs="Times New Roman"/>
+              </w:rPr>
               <w:t>_smt1_est</w:t>
             </w:r>
             <w:proofErr w:type="gramStart"/>
             <w:r>
-              <w:t>$}/{</w:t>
+              <w:rPr>
+                <w:rFonts w:ascii="Times New Roman" w:hAnsi="Times New Roman" w:cs="Times New Roman"/>
+              </w:rPr>
+              <w:t>$} / {</w:t>
             </w:r>
             <w:proofErr w:type="gramEnd"/>
             <w:r>
+              <w:rPr>
+                <w:rFonts w:ascii="Times New Roman" w:hAnsi="Times New Roman" w:cs="Times New Roman"/>
+              </w:rPr>
               <w:t>$</w:t>
             </w:r>
             <w:r>
+              <w:rPr>
+                <w:rFonts w:ascii="Times New Roman" w:hAnsi="Times New Roman" w:cs="Times New Roman"/>
+              </w:rPr>
               <w:t>s8</w:t>
             </w:r>
             <w:r>
+              <w:rPr>
+                <w:rFonts w:ascii="Times New Roman" w:hAnsi="Times New Roman" w:cs="Times New Roman"/>
+              </w:rPr>
               <w:t>_smt1_ayu$}</w:t>
             </w:r>
           </w:p>
@@ -22004,26 +23263,47 @@
               <w:spacing w:after="0" w:line="240" w:lineRule="auto"/>
             </w:pPr>
             <w:r>
+              <w:rPr>
+                <w:rFonts w:ascii="Times New Roman" w:hAnsi="Times New Roman" w:cs="Times New Roman"/>
+              </w:rPr>
               <w:t>{$</w:t>
             </w:r>
             <w:r>
+              <w:rPr>
+                <w:rFonts w:ascii="Times New Roman" w:hAnsi="Times New Roman" w:cs="Times New Roman"/>
+              </w:rPr>
               <w:t>s8</w:t>
             </w:r>
             <w:r>
+              <w:rPr>
+                <w:rFonts w:ascii="Times New Roman" w:hAnsi="Times New Roman" w:cs="Times New Roman"/>
+              </w:rPr>
               <w:t>_smt2_est</w:t>
             </w:r>
             <w:proofErr w:type="gramStart"/>
             <w:r>
-              <w:t>$}/{</w:t>
+              <w:rPr>
+                <w:rFonts w:ascii="Times New Roman" w:hAnsi="Times New Roman" w:cs="Times New Roman"/>
+              </w:rPr>
+              <w:t>$} / {</w:t>
             </w:r>
             <w:proofErr w:type="gramEnd"/>
             <w:r>
+              <w:rPr>
+                <w:rFonts w:ascii="Times New Roman" w:hAnsi="Times New Roman" w:cs="Times New Roman"/>
+              </w:rPr>
               <w:t>$</w:t>
             </w:r>
             <w:r>
+              <w:rPr>
+                <w:rFonts w:ascii="Times New Roman" w:hAnsi="Times New Roman" w:cs="Times New Roman"/>
+              </w:rPr>
               <w:t>s8</w:t>
             </w:r>
             <w:r>
+              <w:rPr>
+                <w:rFonts w:ascii="Times New Roman" w:hAnsi="Times New Roman" w:cs="Times New Roman"/>
+              </w:rPr>
               <w:t>_smt2_ayu$}</w:t>
             </w:r>
           </w:p>
@@ -22209,26 +23489,47 @@
               <w:spacing w:after="0" w:line="240" w:lineRule="auto"/>
             </w:pPr>
             <w:r>
+              <w:rPr>
+                <w:rFonts w:ascii="Times New Roman" w:hAnsi="Times New Roman" w:cs="Times New Roman"/>
+              </w:rPr>
               <w:t>{$</w:t>
             </w:r>
             <w:r>
+              <w:rPr>
+                <w:rFonts w:ascii="Times New Roman" w:hAnsi="Times New Roman" w:cs="Times New Roman"/>
+              </w:rPr>
               <w:t>s8</w:t>
             </w:r>
             <w:r>
+              <w:rPr>
+                <w:rFonts w:ascii="Times New Roman" w:hAnsi="Times New Roman" w:cs="Times New Roman"/>
+              </w:rPr>
               <w:t>_smt3_est</w:t>
             </w:r>
             <w:proofErr w:type="gramStart"/>
             <w:r>
-              <w:t>$}/{</w:t>
+              <w:rPr>
+                <w:rFonts w:ascii="Times New Roman" w:hAnsi="Times New Roman" w:cs="Times New Roman"/>
+              </w:rPr>
+              <w:t>$} / {</w:t>
             </w:r>
             <w:proofErr w:type="gramEnd"/>
             <w:r>
+              <w:rPr>
+                <w:rFonts w:ascii="Times New Roman" w:hAnsi="Times New Roman" w:cs="Times New Roman"/>
+              </w:rPr>
               <w:t>$</w:t>
             </w:r>
             <w:r>
+              <w:rPr>
+                <w:rFonts w:ascii="Times New Roman" w:hAnsi="Times New Roman" w:cs="Times New Roman"/>
+              </w:rPr>
               <w:t>s8</w:t>
             </w:r>
             <w:r>
+              <w:rPr>
+                <w:rFonts w:ascii="Times New Roman" w:hAnsi="Times New Roman" w:cs="Times New Roman"/>
+              </w:rPr>
               <w:t>_smt3_ayu$}</w:t>
             </w:r>
           </w:p>
@@ -22412,26 +23713,47 @@
               <w:spacing w:after="0" w:line="240" w:lineRule="auto"/>
             </w:pPr>
             <w:r>
+              <w:rPr>
+                <w:rFonts w:ascii="Times New Roman" w:hAnsi="Times New Roman" w:cs="Times New Roman"/>
+              </w:rPr>
               <w:t>{$</w:t>
             </w:r>
             <w:r>
+              <w:rPr>
+                <w:rFonts w:ascii="Times New Roman" w:hAnsi="Times New Roman" w:cs="Times New Roman"/>
+              </w:rPr>
               <w:t>s8</w:t>
             </w:r>
             <w:r>
+              <w:rPr>
+                <w:rFonts w:ascii="Times New Roman" w:hAnsi="Times New Roman" w:cs="Times New Roman"/>
+              </w:rPr>
               <w:t>_smt4_est</w:t>
             </w:r>
             <w:proofErr w:type="gramStart"/>
             <w:r>
-              <w:t>$}/{</w:t>
+              <w:rPr>
+                <w:rFonts w:ascii="Times New Roman" w:hAnsi="Times New Roman" w:cs="Times New Roman"/>
+              </w:rPr>
+              <w:t>$} / {</w:t>
             </w:r>
             <w:proofErr w:type="gramEnd"/>
             <w:r>
+              <w:rPr>
+                <w:rFonts w:ascii="Times New Roman" w:hAnsi="Times New Roman" w:cs="Times New Roman"/>
+              </w:rPr>
               <w:t>$</w:t>
             </w:r>
             <w:r>
+              <w:rPr>
+                <w:rFonts w:ascii="Times New Roman" w:hAnsi="Times New Roman" w:cs="Times New Roman"/>
+              </w:rPr>
               <w:t>s8</w:t>
             </w:r>
             <w:r>
+              <w:rPr>
+                <w:rFonts w:ascii="Times New Roman" w:hAnsi="Times New Roman" w:cs="Times New Roman"/>
+              </w:rPr>
               <w:t>_smt4_ayu$}</w:t>
             </w:r>
           </w:p>
@@ -22763,12 +24085,21 @@
               <w:spacing w:after="0" w:line="240" w:lineRule="auto"/>
             </w:pPr>
             <w:r>
+              <w:rPr>
+                <w:rFonts w:ascii="Times New Roman" w:hAnsi="Times New Roman" w:cs="Times New Roman"/>
+              </w:rPr>
               <w:t>{$</w:t>
             </w:r>
             <w:r>
+              <w:rPr>
+                <w:rFonts w:ascii="Times New Roman" w:hAnsi="Times New Roman" w:cs="Times New Roman"/>
+              </w:rPr>
               <w:t>s8</w:t>
             </w:r>
             <w:r>
+              <w:rPr>
+                <w:rFonts w:ascii="Times New Roman" w:hAnsi="Times New Roman" w:cs="Times New Roman"/>
+              </w:rPr>
               <w:t>_vc1_cond$}</w:t>
             </w:r>
           </w:p>
@@ -22920,12 +24251,21 @@
               <w:spacing w:after="0" w:line="240" w:lineRule="auto"/>
             </w:pPr>
             <w:r>
+              <w:rPr>
+                <w:rFonts w:ascii="Times New Roman" w:hAnsi="Times New Roman" w:cs="Times New Roman"/>
+              </w:rPr>
               <w:t>{$</w:t>
             </w:r>
             <w:r>
+              <w:rPr>
+                <w:rFonts w:ascii="Times New Roman" w:hAnsi="Times New Roman" w:cs="Times New Roman"/>
+              </w:rPr>
               <w:t>s8</w:t>
             </w:r>
             <w:r>
+              <w:rPr>
+                <w:rFonts w:ascii="Times New Roman" w:hAnsi="Times New Roman" w:cs="Times New Roman"/>
+              </w:rPr>
               <w:t>_vc2_cond$}</w:t>
             </w:r>
           </w:p>
@@ -23098,26 +24438,47 @@
               <w:spacing w:after="0" w:line="240" w:lineRule="auto"/>
             </w:pPr>
             <w:r>
+              <w:rPr>
+                <w:rFonts w:ascii="Times New Roman" w:hAnsi="Times New Roman" w:cs="Times New Roman"/>
+              </w:rPr>
               <w:t>{$</w:t>
             </w:r>
             <w:r>
+              <w:rPr>
+                <w:rFonts w:ascii="Times New Roman" w:hAnsi="Times New Roman" w:cs="Times New Roman"/>
+              </w:rPr>
               <w:t>s8</w:t>
             </w:r>
             <w:r>
+              <w:rPr>
+                <w:rFonts w:ascii="Times New Roman" w:hAnsi="Times New Roman" w:cs="Times New Roman"/>
+              </w:rPr>
               <w:t>_ebc_cond</w:t>
             </w:r>
             <w:proofErr w:type="gramStart"/>
             <w:r>
-              <w:t>$}/{</w:t>
+              <w:rPr>
+                <w:rFonts w:ascii="Times New Roman" w:hAnsi="Times New Roman" w:cs="Times New Roman"/>
+              </w:rPr>
+              <w:t>$} / {</w:t>
             </w:r>
             <w:proofErr w:type="gramEnd"/>
             <w:r>
+              <w:rPr>
+                <w:rFonts w:ascii="Times New Roman" w:hAnsi="Times New Roman" w:cs="Times New Roman"/>
+              </w:rPr>
               <w:t>$</w:t>
             </w:r>
             <w:r>
+              <w:rPr>
+                <w:rFonts w:ascii="Times New Roman" w:hAnsi="Times New Roman" w:cs="Times New Roman"/>
+              </w:rPr>
               <w:t>s8</w:t>
             </w:r>
             <w:r>
+              <w:rPr>
+                <w:rFonts w:ascii="Times New Roman" w:hAnsi="Times New Roman" w:cs="Times New Roman"/>
+              </w:rPr>
               <w:t>_ebc_lect$}</w:t>
             </w:r>
           </w:p>
@@ -23379,12 +24740,21 @@
               <w:spacing w:after="0" w:line="240" w:lineRule="auto"/>
             </w:pPr>
             <w:r>
+              <w:rPr>
+                <w:rFonts w:ascii="Times New Roman" w:hAnsi="Times New Roman" w:cs="Times New Roman"/>
+              </w:rPr>
               <w:t>{$</w:t>
             </w:r>
             <w:r>
+              <w:rPr>
+                <w:rFonts w:ascii="Times New Roman" w:hAnsi="Times New Roman" w:cs="Times New Roman"/>
+              </w:rPr>
               <w:t>s8</w:t>
             </w:r>
             <w:r>
+              <w:rPr>
+                <w:rFonts w:ascii="Times New Roman" w:hAnsi="Times New Roman" w:cs="Times New Roman"/>
+              </w:rPr>
               <w:t>_oracion_ci$}</w:t>
             </w:r>
           </w:p>
@@ -23448,11 +24818,15 @@
               <w:spacing w:after="60" w:line="240" w:lineRule="auto"/>
               <w:rPr>
                 <w:b/>
-              </w:rPr>
-            </w:pPr>
-            <w:r>
-              <w:rPr>
-                <w:b/>
+                <w:sz w:val="28"/>
+                <w:szCs w:val="28"/>
+              </w:rPr>
+            </w:pPr>
+            <w:r>
+              <w:rPr>
+                <w:b/>
+                <w:sz w:val="28"/>
+                <w:szCs w:val="28"/>
               </w:rPr>
               <w:lastRenderedPageBreak/>
               <w:t>{$</w:t>
@@ -23462,6 +24836,8 @@
               <w:rPr>
                 <w:b/>
                 <w:bCs/>
+                <w:sz w:val="28"/>
+                <w:szCs w:val="28"/>
               </w:rPr>
               <w:t>congregacion</w:t>
             </w:r>
@@ -23469,6 +24845,8 @@
             <w:r>
               <w:rPr>
                 <w:b/>
+                <w:sz w:val="28"/>
+                <w:szCs w:val="28"/>
               </w:rPr>
               <w:t>$}</w:t>
             </w:r>
@@ -23554,6 +24932,7 @@
             <w:pPr>
               <w:spacing w:after="0" w:line="240" w:lineRule="auto"/>
               <w:rPr>
+                <w:rFonts w:ascii="Times New Roman" w:hAnsi="Times New Roman" w:cs="Times New Roman"/>
                 <w:b/>
                 <w:color w:val="808080" w:themeColor="background1" w:themeShade="80"/>
                 <w:sz w:val="16"/>
@@ -23563,6 +24942,7 @@
             </w:pPr>
             <w:r>
               <w:rPr>
+                <w:rFonts w:ascii="Times New Roman" w:hAnsi="Times New Roman" w:cs="Times New Roman"/>
                 <w:b/>
                 <w:lang w:val="es-MX"/>
               </w:rPr>
@@ -23570,6 +24950,7 @@
             </w:r>
             <w:r>
               <w:rPr>
+                <w:rFonts w:ascii="Times New Roman" w:hAnsi="Times New Roman" w:cs="Times New Roman"/>
                 <w:b/>
                 <w:lang w:val="es-MX"/>
               </w:rPr>
@@ -23577,6 +24958,7 @@
             </w:r>
             <w:r>
               <w:rPr>
+                <w:rFonts w:ascii="Times New Roman" w:hAnsi="Times New Roman" w:cs="Times New Roman"/>
                 <w:b/>
                 <w:lang w:val="es-MX"/>
               </w:rPr>
@@ -23630,12 +25012,21 @@
               <w:spacing w:after="0" w:line="240" w:lineRule="auto"/>
             </w:pPr>
             <w:r>
+              <w:rPr>
+                <w:rFonts w:ascii="Times New Roman" w:hAnsi="Times New Roman" w:cs="Times New Roman"/>
+              </w:rPr>
               <w:t>{$</w:t>
             </w:r>
             <w:r>
+              <w:rPr>
+                <w:rFonts w:ascii="Times New Roman" w:hAnsi="Times New Roman" w:cs="Times New Roman"/>
+              </w:rPr>
               <w:t>s9</w:t>
             </w:r>
             <w:r>
+              <w:rPr>
+                <w:rFonts w:ascii="Times New Roman" w:hAnsi="Times New Roman" w:cs="Times New Roman"/>
+              </w:rPr>
               <w:t>_presidente$}</w:t>
             </w:r>
           </w:p>
@@ -23790,12 +25181,21 @@
               <w:spacing w:after="0" w:line="240" w:lineRule="auto"/>
             </w:pPr>
             <w:r>
+              <w:rPr>
+                <w:rFonts w:ascii="Times New Roman" w:hAnsi="Times New Roman" w:cs="Times New Roman"/>
+              </w:rPr>
               <w:t>{$</w:t>
             </w:r>
             <w:r>
+              <w:rPr>
+                <w:rFonts w:ascii="Times New Roman" w:hAnsi="Times New Roman" w:cs="Times New Roman"/>
+              </w:rPr>
               <w:t>s9</w:t>
             </w:r>
             <w:r>
+              <w:rPr>
+                <w:rFonts w:ascii="Times New Roman" w:hAnsi="Times New Roman" w:cs="Times New Roman"/>
+              </w:rPr>
               <w:t>_oracion_ap$}</w:t>
             </w:r>
           </w:p>
@@ -24158,12 +25558,21 @@
               <w:spacing w:after="0" w:line="240" w:lineRule="auto"/>
             </w:pPr>
             <w:r>
+              <w:rPr>
+                <w:rFonts w:ascii="Times New Roman" w:hAnsi="Times New Roman" w:cs="Times New Roman"/>
+              </w:rPr>
               <w:t>{$</w:t>
             </w:r>
             <w:r>
+              <w:rPr>
+                <w:rFonts w:ascii="Times New Roman" w:hAnsi="Times New Roman" w:cs="Times New Roman"/>
+              </w:rPr>
               <w:t>s9</w:t>
             </w:r>
             <w:r>
+              <w:rPr>
+                <w:rFonts w:ascii="Times New Roman" w:hAnsi="Times New Roman" w:cs="Times New Roman"/>
+              </w:rPr>
               <w:t>_tb_cond$}</w:t>
             </w:r>
           </w:p>
@@ -24323,12 +25732,21 @@
               <w:spacing w:after="0" w:line="240" w:lineRule="auto"/>
             </w:pPr>
             <w:r>
+              <w:rPr>
+                <w:rFonts w:ascii="Times New Roman" w:hAnsi="Times New Roman" w:cs="Times New Roman"/>
+              </w:rPr>
               <w:t>{$</w:t>
             </w:r>
             <w:r>
+              <w:rPr>
+                <w:rFonts w:ascii="Times New Roman" w:hAnsi="Times New Roman" w:cs="Times New Roman"/>
+              </w:rPr>
               <w:t>s9</w:t>
             </w:r>
             <w:r>
+              <w:rPr>
+                <w:rFonts w:ascii="Times New Roman" w:hAnsi="Times New Roman" w:cs="Times New Roman"/>
+              </w:rPr>
               <w:t>_pe_cond$}</w:t>
             </w:r>
           </w:p>
@@ -24488,12 +25906,21 @@
               <w:spacing w:after="0" w:line="240" w:lineRule="auto"/>
             </w:pPr>
             <w:r>
+              <w:rPr>
+                <w:rFonts w:ascii="Times New Roman" w:hAnsi="Times New Roman" w:cs="Times New Roman"/>
+              </w:rPr>
               <w:t>{$</w:t>
             </w:r>
             <w:r>
+              <w:rPr>
+                <w:rFonts w:ascii="Times New Roman" w:hAnsi="Times New Roman" w:cs="Times New Roman"/>
+              </w:rPr>
               <w:t>s9</w:t>
             </w:r>
             <w:r>
+              <w:rPr>
+                <w:rFonts w:ascii="Times New Roman" w:hAnsi="Times New Roman" w:cs="Times New Roman"/>
+              </w:rPr>
               <w:t>_lb_est$}</w:t>
             </w:r>
           </w:p>
@@ -24786,26 +26213,47 @@
               <w:spacing w:after="0" w:line="240" w:lineRule="auto"/>
             </w:pPr>
             <w:r>
+              <w:rPr>
+                <w:rFonts w:ascii="Times New Roman" w:hAnsi="Times New Roman" w:cs="Times New Roman"/>
+              </w:rPr>
               <w:t>{$</w:t>
             </w:r>
             <w:r>
+              <w:rPr>
+                <w:rFonts w:ascii="Times New Roman" w:hAnsi="Times New Roman" w:cs="Times New Roman"/>
+              </w:rPr>
               <w:t>s9</w:t>
             </w:r>
             <w:r>
+              <w:rPr>
+                <w:rFonts w:ascii="Times New Roman" w:hAnsi="Times New Roman" w:cs="Times New Roman"/>
+              </w:rPr>
               <w:t>_smt1_est</w:t>
             </w:r>
             <w:proofErr w:type="gramStart"/>
             <w:r>
-              <w:t>$}/{</w:t>
+              <w:rPr>
+                <w:rFonts w:ascii="Times New Roman" w:hAnsi="Times New Roman" w:cs="Times New Roman"/>
+              </w:rPr>
+              <w:t>$} / {</w:t>
             </w:r>
             <w:proofErr w:type="gramEnd"/>
             <w:r>
+              <w:rPr>
+                <w:rFonts w:ascii="Times New Roman" w:hAnsi="Times New Roman" w:cs="Times New Roman"/>
+              </w:rPr>
               <w:t>$</w:t>
             </w:r>
             <w:r>
+              <w:rPr>
+                <w:rFonts w:ascii="Times New Roman" w:hAnsi="Times New Roman" w:cs="Times New Roman"/>
+              </w:rPr>
               <w:t>s9</w:t>
             </w:r>
             <w:r>
+              <w:rPr>
+                <w:rFonts w:ascii="Times New Roman" w:hAnsi="Times New Roman" w:cs="Times New Roman"/>
+              </w:rPr>
               <w:t>_smt1_ayu$}</w:t>
             </w:r>
           </w:p>
@@ -24991,26 +26439,47 @@
               <w:spacing w:after="0" w:line="240" w:lineRule="auto"/>
             </w:pPr>
             <w:r>
+              <w:rPr>
+                <w:rFonts w:ascii="Times New Roman" w:hAnsi="Times New Roman" w:cs="Times New Roman"/>
+              </w:rPr>
               <w:t>{$</w:t>
             </w:r>
             <w:r>
+              <w:rPr>
+                <w:rFonts w:ascii="Times New Roman" w:hAnsi="Times New Roman" w:cs="Times New Roman"/>
+              </w:rPr>
               <w:t>s9</w:t>
             </w:r>
             <w:r>
+              <w:rPr>
+                <w:rFonts w:ascii="Times New Roman" w:hAnsi="Times New Roman" w:cs="Times New Roman"/>
+              </w:rPr>
               <w:t>_smt2_est</w:t>
             </w:r>
             <w:proofErr w:type="gramStart"/>
             <w:r>
-              <w:t>$}/{</w:t>
+              <w:rPr>
+                <w:rFonts w:ascii="Times New Roman" w:hAnsi="Times New Roman" w:cs="Times New Roman"/>
+              </w:rPr>
+              <w:t>$} / {</w:t>
             </w:r>
             <w:proofErr w:type="gramEnd"/>
             <w:r>
+              <w:rPr>
+                <w:rFonts w:ascii="Times New Roman" w:hAnsi="Times New Roman" w:cs="Times New Roman"/>
+              </w:rPr>
               <w:t>$</w:t>
             </w:r>
             <w:r>
+              <w:rPr>
+                <w:rFonts w:ascii="Times New Roman" w:hAnsi="Times New Roman" w:cs="Times New Roman"/>
+              </w:rPr>
               <w:t>s9</w:t>
             </w:r>
             <w:r>
+              <w:rPr>
+                <w:rFonts w:ascii="Times New Roman" w:hAnsi="Times New Roman" w:cs="Times New Roman"/>
+              </w:rPr>
               <w:t>_smt2_ayu$}</w:t>
             </w:r>
           </w:p>
@@ -25196,26 +26665,47 @@
               <w:spacing w:after="0" w:line="240" w:lineRule="auto"/>
             </w:pPr>
             <w:r>
+              <w:rPr>
+                <w:rFonts w:ascii="Times New Roman" w:hAnsi="Times New Roman" w:cs="Times New Roman"/>
+              </w:rPr>
               <w:t>{$</w:t>
             </w:r>
             <w:r>
+              <w:rPr>
+                <w:rFonts w:ascii="Times New Roman" w:hAnsi="Times New Roman" w:cs="Times New Roman"/>
+              </w:rPr>
               <w:t>s9</w:t>
             </w:r>
             <w:r>
+              <w:rPr>
+                <w:rFonts w:ascii="Times New Roman" w:hAnsi="Times New Roman" w:cs="Times New Roman"/>
+              </w:rPr>
               <w:t>_smt3_est</w:t>
             </w:r>
             <w:proofErr w:type="gramStart"/>
             <w:r>
-              <w:t>$}/{</w:t>
+              <w:rPr>
+                <w:rFonts w:ascii="Times New Roman" w:hAnsi="Times New Roman" w:cs="Times New Roman"/>
+              </w:rPr>
+              <w:t>$} / {</w:t>
             </w:r>
             <w:proofErr w:type="gramEnd"/>
             <w:r>
+              <w:rPr>
+                <w:rFonts w:ascii="Times New Roman" w:hAnsi="Times New Roman" w:cs="Times New Roman"/>
+              </w:rPr>
               <w:t>$</w:t>
             </w:r>
             <w:r>
+              <w:rPr>
+                <w:rFonts w:ascii="Times New Roman" w:hAnsi="Times New Roman" w:cs="Times New Roman"/>
+              </w:rPr>
               <w:t>s9</w:t>
             </w:r>
             <w:r>
+              <w:rPr>
+                <w:rFonts w:ascii="Times New Roman" w:hAnsi="Times New Roman" w:cs="Times New Roman"/>
+              </w:rPr>
               <w:t>_smt3_ayu$}</w:t>
             </w:r>
           </w:p>
@@ -25399,26 +26889,47 @@
               <w:spacing w:after="0" w:line="240" w:lineRule="auto"/>
             </w:pPr>
             <w:r>
+              <w:rPr>
+                <w:rFonts w:ascii="Times New Roman" w:hAnsi="Times New Roman" w:cs="Times New Roman"/>
+              </w:rPr>
               <w:t>{$</w:t>
             </w:r>
             <w:r>
+              <w:rPr>
+                <w:rFonts w:ascii="Times New Roman" w:hAnsi="Times New Roman" w:cs="Times New Roman"/>
+              </w:rPr>
               <w:t>s9</w:t>
             </w:r>
             <w:r>
+              <w:rPr>
+                <w:rFonts w:ascii="Times New Roman" w:hAnsi="Times New Roman" w:cs="Times New Roman"/>
+              </w:rPr>
               <w:t>_smt4_est</w:t>
             </w:r>
             <w:proofErr w:type="gramStart"/>
             <w:r>
-              <w:t>$}/{</w:t>
+              <w:rPr>
+                <w:rFonts w:ascii="Times New Roman" w:hAnsi="Times New Roman" w:cs="Times New Roman"/>
+              </w:rPr>
+              <w:t>$} / {</w:t>
             </w:r>
             <w:proofErr w:type="gramEnd"/>
             <w:r>
+              <w:rPr>
+                <w:rFonts w:ascii="Times New Roman" w:hAnsi="Times New Roman" w:cs="Times New Roman"/>
+              </w:rPr>
               <w:t>$</w:t>
             </w:r>
             <w:r>
+              <w:rPr>
+                <w:rFonts w:ascii="Times New Roman" w:hAnsi="Times New Roman" w:cs="Times New Roman"/>
+              </w:rPr>
               <w:t>s9</w:t>
             </w:r>
             <w:r>
+              <w:rPr>
+                <w:rFonts w:ascii="Times New Roman" w:hAnsi="Times New Roman" w:cs="Times New Roman"/>
+              </w:rPr>
               <w:t>_smt4_ayu$}</w:t>
             </w:r>
           </w:p>
@@ -25750,12 +27261,21 @@
               <w:spacing w:after="0" w:line="240" w:lineRule="auto"/>
             </w:pPr>
             <w:r>
+              <w:rPr>
+                <w:rFonts w:ascii="Times New Roman" w:hAnsi="Times New Roman" w:cs="Times New Roman"/>
+              </w:rPr>
               <w:t>{$</w:t>
             </w:r>
             <w:r>
+              <w:rPr>
+                <w:rFonts w:ascii="Times New Roman" w:hAnsi="Times New Roman" w:cs="Times New Roman"/>
+              </w:rPr>
               <w:t>s9</w:t>
             </w:r>
             <w:r>
+              <w:rPr>
+                <w:rFonts w:ascii="Times New Roman" w:hAnsi="Times New Roman" w:cs="Times New Roman"/>
+              </w:rPr>
               <w:t>_vc1_cond$}</w:t>
             </w:r>
           </w:p>
@@ -25907,12 +27427,21 @@
               <w:spacing w:after="0" w:line="240" w:lineRule="auto"/>
             </w:pPr>
             <w:r>
+              <w:rPr>
+                <w:rFonts w:ascii="Times New Roman" w:hAnsi="Times New Roman" w:cs="Times New Roman"/>
+              </w:rPr>
               <w:t>{$</w:t>
             </w:r>
             <w:r>
+              <w:rPr>
+                <w:rFonts w:ascii="Times New Roman" w:hAnsi="Times New Roman" w:cs="Times New Roman"/>
+              </w:rPr>
               <w:t>s9</w:t>
             </w:r>
             <w:r>
+              <w:rPr>
+                <w:rFonts w:ascii="Times New Roman" w:hAnsi="Times New Roman" w:cs="Times New Roman"/>
+              </w:rPr>
               <w:t>_vc2_cond$}</w:t>
             </w:r>
           </w:p>
@@ -26091,26 +27620,47 @@
               <w:spacing w:after="0" w:line="240" w:lineRule="auto"/>
             </w:pPr>
             <w:r>
+              <w:rPr>
+                <w:rFonts w:ascii="Times New Roman" w:hAnsi="Times New Roman" w:cs="Times New Roman"/>
+              </w:rPr>
               <w:t>{$</w:t>
             </w:r>
             <w:r>
+              <w:rPr>
+                <w:rFonts w:ascii="Times New Roman" w:hAnsi="Times New Roman" w:cs="Times New Roman"/>
+              </w:rPr>
               <w:t>s9</w:t>
             </w:r>
             <w:r>
+              <w:rPr>
+                <w:rFonts w:ascii="Times New Roman" w:hAnsi="Times New Roman" w:cs="Times New Roman"/>
+              </w:rPr>
               <w:t>_ebc_cond</w:t>
             </w:r>
             <w:proofErr w:type="gramStart"/>
             <w:r>
-              <w:t>$}/{</w:t>
+              <w:rPr>
+                <w:rFonts w:ascii="Times New Roman" w:hAnsi="Times New Roman" w:cs="Times New Roman"/>
+              </w:rPr>
+              <w:t>$} / {</w:t>
             </w:r>
             <w:proofErr w:type="gramEnd"/>
             <w:r>
+              <w:rPr>
+                <w:rFonts w:ascii="Times New Roman" w:hAnsi="Times New Roman" w:cs="Times New Roman"/>
+              </w:rPr>
               <w:t>$</w:t>
             </w:r>
             <w:r>
+              <w:rPr>
+                <w:rFonts w:ascii="Times New Roman" w:hAnsi="Times New Roman" w:cs="Times New Roman"/>
+              </w:rPr>
               <w:t>s9</w:t>
             </w:r>
             <w:r>
+              <w:rPr>
+                <w:rFonts w:ascii="Times New Roman" w:hAnsi="Times New Roman" w:cs="Times New Roman"/>
+              </w:rPr>
               <w:t>_ebc_lect$}</w:t>
             </w:r>
           </w:p>
@@ -26372,12 +27922,21 @@
               <w:spacing w:after="0" w:line="240" w:lineRule="auto"/>
             </w:pPr>
             <w:r>
+              <w:rPr>
+                <w:rFonts w:ascii="Times New Roman" w:hAnsi="Times New Roman" w:cs="Times New Roman"/>
+              </w:rPr>
               <w:t>{$</w:t>
             </w:r>
             <w:r>
+              <w:rPr>
+                <w:rFonts w:ascii="Times New Roman" w:hAnsi="Times New Roman" w:cs="Times New Roman"/>
+              </w:rPr>
               <w:t>s9</w:t>
             </w:r>
             <w:r>
+              <w:rPr>
+                <w:rFonts w:ascii="Times New Roman" w:hAnsi="Times New Roman" w:cs="Times New Roman"/>
+              </w:rPr>
               <w:t>_oracion_ci$}</w:t>
             </w:r>
           </w:p>

</xml_diff>